<commit_message>
Add course materials: syllabus, schedule, instructor notes, review guides, glossary and paradigm appendices
Generate Appendix B glossary and Moodle glossary from a cleaned vocabulary TSV
(28 spellings corrected, 5 duplicates dropped); add missing words to L2, L3, L10.
Fix L3/L5-L11 forms from the accuracy audit (L11: tbar, naḥḥem, q-r-y, kurhānā).
Exams, answer keys and their generator are gitignored to keep them off this public repo.

Co-Authored-By: Claude Opus 5.5 <noreply@anthropic.com>
</commit_message>
<xml_diff>
--- a/Lesson_00_The_Alphabet.docx
+++ b/Lesson_00_The_Alphabet.docx
@@ -2,61 +2,42 @@
 <file path=word/document.xml><?xml version="1.0" encoding="utf-8"?>
 <w:document xmlns:w="http://schemas.openxmlformats.org/wordprocessingml/2006/main" xmlns:m="http://schemas.openxmlformats.org/officeDocument/2006/math" xmlns:r="http://schemas.openxmlformats.org/officeDocument/2006/relationships" xmlns:o="urn:schemas-microsoft-com:office:office" xmlns:v="urn:schemas-microsoft-com:vml" xmlns:w10="urn:schemas-microsoft-com:office:word" xmlns:a="http://schemas.openxmlformats.org/drawingml/2006/main" xmlns:pic="http://schemas.openxmlformats.org/drawingml/2006/picture" xmlns:wp="http://schemas.openxmlformats.org/drawingml/2006/wordprocessingDrawing">
   <w:body>
-    <w:bookmarkStart w:id="19" w:name="the-acts-of-mar-yukhannan"/>
-    <w:p>
-      <w:pPr>
-        <w:pStyle w:val="Heading1"/>
-      </w:pPr>
-      <w:r>
-        <w:t xml:space="preserve">The Acts of Mar Yukhannan</w:t>
-      </w:r>
-    </w:p>
     <w:p>
       <w:pPr>
         <w:pStyle w:val="FirstParagraph"/>
       </w:pPr>
       <w:r>
-        <w:t xml:space="preserve">An Immersive Syriac Language Course</w:t>
-      </w:r>
-    </w:p>
-    <w:bookmarkStart w:id="18" w:name="lesson-0"/>
-    <w:p>
-      <w:pPr>
-        <w:pStyle w:val="Heading2"/>
-      </w:pPr>
-      <w:r>
-        <w:t xml:space="preserve">LESSON 0</w:t>
-      </w:r>
-    </w:p>
-    <w:bookmarkStart w:id="17" w:name="X0155c224e0664b5bebb96c0523aa6b2fa9a5c3c"/>
+        <w:t xml:space="preserve">Lesson 0 · Introductory/Optional</w:t>
+      </w:r>
+      <w:r>
+        <w:t xml:space="preserve">The Syriac Alphabet</w:t>
+      </w:r>
+    </w:p>
+    <w:p>
+      <w:pPr>
+        <w:pStyle w:val="BlockText"/>
+      </w:pPr>
+      <w:r>
+        <w:rPr>
+          <w:b/>
+          <w:bCs/>
+        </w:rPr>
+        <w:t xml:space="preserve">Note:</w:t>
+      </w:r>
+      <w:r>
+        <w:t xml:space="preserve"> </w:t>
+      </w:r>
+      <w:r>
+        <w:t xml:space="preserve">This lesson is supplementary to the 12-lesson course plan. It is recommended for students with no prior exposure to Syriac script. Students who already read Estrangela may proceed directly to Lesson 1.</w:t>
+      </w:r>
+    </w:p>
+    <w:bookmarkStart w:id="28" w:name="X0155c224e0664b5bebb96c0523aa6b2fa9a5c3c"/>
     <w:p>
       <w:pPr>
         <w:pStyle w:val="Heading3"/>
       </w:pPr>
       <w:r>
         <w:t xml:space="preserve">The Alphabet and the Light: The Estrangela Script</w:t>
-      </w:r>
-    </w:p>
-    <w:p>
-      <w:pPr>
-        <w:pStyle w:val="FirstParagraph"/>
-      </w:pPr>
-      <w:r>
-        <w:rPr>
-          <w:i/>
-          <w:iCs/>
-        </w:rPr>
-        <w:t xml:space="preserve">Estrangela script · Transliteration · Phonetics</w:t>
-      </w:r>
-      <w:r>
-        <w:t xml:space="preserve"> </w:t>
-      </w:r>
-      <w:r>
-        <w:rPr>
-          <w:i/>
-          <w:iCs/>
-        </w:rPr>
-        <w:t xml:space="preserve">Semitic cognates (Hebrew &amp; Arabic) included</w:t>
       </w:r>
     </w:p>
     <w:p>
@@ -66,7 +47,7 @@
         </w:pict>
       </w:r>
     </w:p>
-    <w:bookmarkStart w:id="9" w:name="section-1-introduction-to-the-script"/>
+    <w:bookmarkStart w:id="20" w:name="section-1-introduction-to-the-script"/>
     <w:p>
       <w:pPr>
         <w:pStyle w:val="Heading4"/>
@@ -115,7 +96,13 @@
         <w:t xml:space="preserve"> </w:t>
       </w:r>
       <w:r>
-        <w:t xml:space="preserve">“rounded.”</w:t>
+        <w:t xml:space="preserve">“</w:t>
+      </w:r>
+      <w:r>
+        <w:t xml:space="preserve">rounded.</w:t>
+      </w:r>
+      <w:r>
+        <w:t xml:space="preserve">”</w:t>
       </w:r>
       <w:r>
         <w:t xml:space="preserve"> </w:t>
@@ -135,15 +122,15 @@
         </w:rPr>
         <w:t xml:space="preserve">Core Principles:</w:t>
       </w:r>
-      <w:r>
-        <w:t xml:space="preserve"> </w:t>
-      </w:r>
-      <w:r>
-        <w:t xml:space="preserve">1.</w:t>
-      </w:r>
-      <w:r>
-        <w:t xml:space="preserve"> </w:t>
-      </w:r>
+    </w:p>
+    <w:p>
+      <w:pPr>
+        <w:pStyle w:val="Compact"/>
+        <w:numPr>
+          <w:ilvl w:val="0"/>
+          <w:numId w:val="1001"/>
+        </w:numPr>
+      </w:pPr>
       <w:r>
         <w:rPr>
           <w:b/>
@@ -154,15 +141,15 @@
       <w:r>
         <w:t xml:space="preserve">: All letters are consonants. Vowels are indicated by separate small marks or dots (to be covered in Lesson 1).</w:t>
       </w:r>
-      <w:r>
-        <w:t xml:space="preserve"> </w:t>
-      </w:r>
-      <w:r>
-        <w:t xml:space="preserve">2.</w:t>
-      </w:r>
-      <w:r>
-        <w:t xml:space="preserve"> </w:t>
-      </w:r>
+    </w:p>
+    <w:p>
+      <w:pPr>
+        <w:pStyle w:val="Compact"/>
+        <w:numPr>
+          <w:ilvl w:val="0"/>
+          <w:numId w:val="1001"/>
+        </w:numPr>
+      </w:pPr>
       <w:r>
         <w:rPr>
           <w:b/>
@@ -177,7 +164,13 @@
         <w:t xml:space="preserve"> </w:t>
       </w:r>
       <w:r>
-        <w:t xml:space="preserve">“non-joiners”</w:t>
+        <w:t xml:space="preserve">“</w:t>
+      </w:r>
+      <w:r>
+        <w:t xml:space="preserve">non-joiners</w:t>
+      </w:r>
+      <w:r>
+        <w:t xml:space="preserve">”</w:t>
       </w:r>
       <w:r>
         <w:t xml:space="preserve"> </w:t>
@@ -185,15 +178,15 @@
       <w:r>
         <w:t xml:space="preserve">— they only connect to the letter before them.</w:t>
       </w:r>
-      <w:r>
-        <w:t xml:space="preserve"> </w:t>
-      </w:r>
-      <w:r>
-        <w:t xml:space="preserve">3.</w:t>
-      </w:r>
-      <w:r>
-        <w:t xml:space="preserve"> </w:t>
-      </w:r>
+    </w:p>
+    <w:p>
+      <w:pPr>
+        <w:pStyle w:val="Compact"/>
+        <w:numPr>
+          <w:ilvl w:val="0"/>
+          <w:numId w:val="1001"/>
+        </w:numPr>
+      </w:pPr>
       <w:r>
         <w:rPr>
           <w:b/>
@@ -204,15 +197,15 @@
       <w:r>
         <w:t xml:space="preserve">: There are no capital letters.</w:t>
       </w:r>
-      <w:r>
-        <w:t xml:space="preserve"> </w:t>
-      </w:r>
-      <w:r>
-        <w:t xml:space="preserve">4.</w:t>
-      </w:r>
-      <w:r>
-        <w:t xml:space="preserve"> </w:t>
-      </w:r>
+    </w:p>
+    <w:p>
+      <w:pPr>
+        <w:pStyle w:val="Compact"/>
+        <w:numPr>
+          <w:ilvl w:val="0"/>
+          <w:numId w:val="1001"/>
+        </w:numPr>
+      </w:pPr>
       <w:r>
         <w:rPr>
           <w:b/>
@@ -231,8 +224,8 @@
         </w:pict>
       </w:r>
     </w:p>
-    <w:bookmarkEnd w:id="9"/>
-    <w:bookmarkStart w:id="10" w:name="Xa293da3809a97d9bd77a74a59e1108d308e2916"/>
+    <w:bookmarkEnd w:id="20"/>
+    <w:bookmarkStart w:id="21" w:name="Xa293da3809a97d9bd77a74a59e1108d308e2916"/>
     <w:p>
       <w:pPr>
         <w:pStyle w:val="Heading4"/>
@@ -252,19 +245,38 @@
         <w:t xml:space="preserve"> </w:t>
       </w:r>
       <w:r>
-        <w:t xml:space="preserve">“Abgad”</w:t>
+        <w:t xml:space="preserve">“</w:t>
+      </w:r>
+      <w:r>
+        <w:t xml:space="preserve">Abgad</w:t>
+      </w:r>
+      <w:r>
+        <w:t xml:space="preserve">”</w:t>
       </w:r>
       <w:r>
         <w:t xml:space="preserve"> </w:t>
       </w:r>
       <w:r>
         <w:t xml:space="preserve">order of Arabic.</w:t>
+      </w:r>
+    </w:p>
+    <w:p>
+      <w:pPr>
+        <w:pStyle w:val="BodyText"/>
+      </w:pPr>
+      <w:r>
+        <w:rPr>
+          <w:b/>
+          <w:bCs/>
+        </w:rPr>
+        <w:t xml:space="preserve">Letters 1–11</w:t>
       </w:r>
     </w:p>
     <w:tbl>
       <w:tblPr>
         <w:tblStyle w:val="Table"/>
         <w:tblW w:type="auto" w:w="0"/>
+        <w:jc w:val="left"/>
         <w:tblLook w:firstRow="1" w:lastRow="0" w:firstColumn="0" w:lastColumn="0" w:noHBand="0" w:noVBand="0" w:val="0020"/>
       </w:tblPr>
       <w:tblGrid>
@@ -397,7 +409,7 @@
               <w:jc w:val="left"/>
             </w:pPr>
             <w:r>
-              <w:t xml:space="preserve">Glottal stop / Silent</w:t>
+              <w:t xml:space="preserve">Glottal stop/silent</w:t>
             </w:r>
           </w:p>
         </w:tc>
@@ -477,7 +489,13 @@
               <w:t xml:space="preserve"> </w:t>
             </w:r>
             <w:r>
-              <w:t xml:space="preserve">‘boy’</w:t>
+              <w:t xml:space="preserve">‘</w:t>
+            </w:r>
+            <w:r>
+              <w:t xml:space="preserve">boy</w:t>
+            </w:r>
+            <w:r>
+              <w:t xml:space="preserve">’</w:t>
             </w:r>
           </w:p>
         </w:tc>
@@ -557,7 +575,13 @@
               <w:t xml:space="preserve"> </w:t>
             </w:r>
             <w:r>
-              <w:t xml:space="preserve">‘go’</w:t>
+              <w:t xml:space="preserve">‘</w:t>
+            </w:r>
+            <w:r>
+              <w:t xml:space="preserve">go</w:t>
+            </w:r>
+            <w:r>
+              <w:t xml:space="preserve">’</w:t>
             </w:r>
           </w:p>
         </w:tc>
@@ -637,7 +661,13 @@
               <w:t xml:space="preserve"> </w:t>
             </w:r>
             <w:r>
-              <w:t xml:space="preserve">‘dog’</w:t>
+              <w:t xml:space="preserve">‘</w:t>
+            </w:r>
+            <w:r>
+              <w:t xml:space="preserve">dog</w:t>
+            </w:r>
+            <w:r>
+              <w:t xml:space="preserve">’</w:t>
             </w:r>
           </w:p>
         </w:tc>
@@ -717,7 +747,13 @@
               <w:t xml:space="preserve"> </w:t>
             </w:r>
             <w:r>
-              <w:t xml:space="preserve">‘house’</w:t>
+              <w:t xml:space="preserve">‘</w:t>
+            </w:r>
+            <w:r>
+              <w:t xml:space="preserve">house</w:t>
+            </w:r>
+            <w:r>
+              <w:t xml:space="preserve">’</w:t>
             </w:r>
           </w:p>
         </w:tc>
@@ -797,7 +833,13 @@
               <w:t xml:space="preserve"> </w:t>
             </w:r>
             <w:r>
-              <w:t xml:space="preserve">‘water’</w:t>
+              <w:t xml:space="preserve">‘</w:t>
+            </w:r>
+            <w:r>
+              <w:t xml:space="preserve">water</w:t>
+            </w:r>
+            <w:r>
+              <w:t xml:space="preserve">’</w:t>
             </w:r>
           </w:p>
         </w:tc>
@@ -877,7 +919,13 @@
               <w:t xml:space="preserve"> </w:t>
             </w:r>
             <w:r>
-              <w:t xml:space="preserve">‘zebra’</w:t>
+              <w:t xml:space="preserve">‘</w:t>
+            </w:r>
+            <w:r>
+              <w:t xml:space="preserve">zebra</w:t>
+            </w:r>
+            <w:r>
+              <w:t xml:space="preserve">’</w:t>
             </w:r>
           </w:p>
         </w:tc>
@@ -951,19 +999,19 @@
               <w:jc w:val="left"/>
             </w:pPr>
             <w:r>
-              <w:t xml:space="preserve">Harsh</w:t>
+              <w:t xml:space="preserve">Pharyngeal</w:t>
             </w:r>
             <w:r>
               <w:t xml:space="preserve"> </w:t>
             </w:r>
             <w:r>
-              <w:t xml:space="preserve">‘h’</w:t>
-            </w:r>
-            <w:r>
-              <w:t xml:space="preserve"> </w:t>
-            </w:r>
-            <w:r>
-              <w:t xml:space="preserve">(pharyngeal)</w:t>
+              <w:t xml:space="preserve">‘</w:t>
+            </w:r>
+            <w:r>
+              <w:t xml:space="preserve">h</w:t>
+            </w:r>
+            <w:r>
+              <w:t xml:space="preserve">’</w:t>
             </w:r>
           </w:p>
         </w:tc>
@@ -1043,7 +1091,13 @@
               <w:t xml:space="preserve"> </w:t>
             </w:r>
             <w:r>
-              <w:t xml:space="preserve">‘t’</w:t>
+              <w:t xml:space="preserve">‘</w:t>
+            </w:r>
+            <w:r>
+              <w:t xml:space="preserve">t</w:t>
+            </w:r>
+            <w:r>
+              <w:t xml:space="preserve">’</w:t>
             </w:r>
           </w:p>
         </w:tc>
@@ -1123,7 +1177,13 @@
               <w:t xml:space="preserve"> </w:t>
             </w:r>
             <w:r>
-              <w:t xml:space="preserve">‘yes’</w:t>
+              <w:t xml:space="preserve">‘</w:t>
+            </w:r>
+            <w:r>
+              <w:t xml:space="preserve">yes</w:t>
+            </w:r>
+            <w:r>
+              <w:t xml:space="preserve">’</w:t>
             </w:r>
           </w:p>
         </w:tc>
@@ -1203,7 +1263,13 @@
               <w:t xml:space="preserve"> </w:t>
             </w:r>
             <w:r>
-              <w:t xml:space="preserve">‘king’</w:t>
+              <w:t xml:space="preserve">‘</w:t>
+            </w:r>
+            <w:r>
+              <w:t xml:space="preserve">king</w:t>
+            </w:r>
+            <w:r>
+              <w:t xml:space="preserve">’</w:t>
             </w:r>
           </w:p>
         </w:tc>
@@ -1228,6 +1294,111 @@
             </w:pPr>
             <w:r>
               <w:t xml:space="preserve">ك</w:t>
+            </w:r>
+          </w:p>
+        </w:tc>
+      </w:tr>
+    </w:tbl>
+    <w:p>
+      <w:pPr>
+        <w:pStyle w:val="BodyText"/>
+      </w:pPr>
+      <w:r>
+        <w:rPr>
+          <w:b/>
+          <w:bCs/>
+        </w:rPr>
+        <w:t xml:space="preserve">Letters 12–22</w:t>
+      </w:r>
+    </w:p>
+    <w:tbl>
+      <w:tblPr>
+        <w:tblStyle w:val="Table"/>
+        <w:tblW w:type="auto" w:w="0"/>
+        <w:jc w:val="left"/>
+        <w:tblLook w:firstRow="1" w:lastRow="0" w:firstColumn="0" w:lastColumn="0" w:noHBand="0" w:noVBand="0" w:val="0020"/>
+      </w:tblPr>
+      <w:tblGrid>
+        <w:gridCol w:w="1320"/>
+        <w:gridCol w:w="1320"/>
+        <w:gridCol w:w="1320"/>
+        <w:gridCol w:w="1320"/>
+        <w:gridCol w:w="1320"/>
+        <w:gridCol w:w="1320"/>
+      </w:tblGrid>
+      <w:tr>
+        <w:trPr>
+          <w:tblHeader w:val="on"/>
+        </w:trPr>
+        <w:tc>
+          <w:tcPr/>
+          <w:p>
+            <w:pPr>
+              <w:pStyle w:val="Compact"/>
+              <w:jc w:val="left"/>
+            </w:pPr>
+            <w:r>
+              <w:t xml:space="preserve">Estrangela</w:t>
+            </w:r>
+          </w:p>
+        </w:tc>
+        <w:tc>
+          <w:tcPr/>
+          <w:p>
+            <w:pPr>
+              <w:pStyle w:val="Compact"/>
+              <w:jc w:val="left"/>
+            </w:pPr>
+            <w:r>
+              <w:t xml:space="preserve">Name</w:t>
+            </w:r>
+          </w:p>
+        </w:tc>
+        <w:tc>
+          <w:tcPr/>
+          <w:p>
+            <w:pPr>
+              <w:pStyle w:val="Compact"/>
+              <w:jc w:val="left"/>
+            </w:pPr>
+            <w:r>
+              <w:t xml:space="preserve">Translit</w:t>
+            </w:r>
+          </w:p>
+        </w:tc>
+        <w:tc>
+          <w:tcPr/>
+          <w:p>
+            <w:pPr>
+              <w:pStyle w:val="Compact"/>
+              <w:jc w:val="left"/>
+            </w:pPr>
+            <w:r>
+              <w:t xml:space="preserve">Phonetic</w:t>
+            </w:r>
+          </w:p>
+        </w:tc>
+        <w:tc>
+          <w:tcPr/>
+          <w:p>
+            <w:pPr>
+              <w:pStyle w:val="Compact"/>
+              <w:jc w:val="left"/>
+            </w:pPr>
+            <w:r>
+              <w:t xml:space="preserve">Hebrew</w:t>
+            </w:r>
+          </w:p>
+        </w:tc>
+        <w:tc>
+          <w:tcPr/>
+          <w:p>
+            <w:pPr>
+              <w:pStyle w:val="Compact"/>
+              <w:jc w:val="left"/>
+            </w:pPr>
+            <w:r>
+              <w:t xml:space="preserve">Arabic</w:t>
             </w:r>
           </w:p>
         </w:tc>
@@ -1283,7 +1454,13 @@
               <w:t xml:space="preserve"> </w:t>
             </w:r>
             <w:r>
-              <w:t xml:space="preserve">‘light’</w:t>
+              <w:t xml:space="preserve">‘</w:t>
+            </w:r>
+            <w:r>
+              <w:t xml:space="preserve">light</w:t>
+            </w:r>
+            <w:r>
+              <w:t xml:space="preserve">’</w:t>
             </w:r>
           </w:p>
         </w:tc>
@@ -1363,7 +1540,13 @@
               <w:t xml:space="preserve"> </w:t>
             </w:r>
             <w:r>
-              <w:t xml:space="preserve">‘man’</w:t>
+              <w:t xml:space="preserve">‘</w:t>
+            </w:r>
+            <w:r>
+              <w:t xml:space="preserve">man</w:t>
+            </w:r>
+            <w:r>
+              <w:t xml:space="preserve">’</w:t>
             </w:r>
           </w:p>
         </w:tc>
@@ -1443,7 +1626,13 @@
               <w:t xml:space="preserve"> </w:t>
             </w:r>
             <w:r>
-              <w:t xml:space="preserve">‘noon’</w:t>
+              <w:t xml:space="preserve">‘</w:t>
+            </w:r>
+            <w:r>
+              <w:t xml:space="preserve">noon</w:t>
+            </w:r>
+            <w:r>
+              <w:t xml:space="preserve">’</w:t>
             </w:r>
           </w:p>
         </w:tc>
@@ -1523,7 +1712,13 @@
               <w:t xml:space="preserve"> </w:t>
             </w:r>
             <w:r>
-              <w:t xml:space="preserve">‘sun’</w:t>
+              <w:t xml:space="preserve">‘</w:t>
+            </w:r>
+            <w:r>
+              <w:t xml:space="preserve">sun</w:t>
+            </w:r>
+            <w:r>
+              <w:t xml:space="preserve">’</w:t>
             </w:r>
           </w:p>
         </w:tc>
@@ -1573,7 +1768,7 @@
               <w:jc w:val="left"/>
             </w:pPr>
             <w:r>
-              <w:t xml:space="preserve">ʿE</w:t>
+              <w:t xml:space="preserve">ʿe</w:t>
             </w:r>
           </w:p>
         </w:tc>
@@ -1597,7 +1792,7 @@
               <w:jc w:val="left"/>
             </w:pPr>
             <w:r>
-              <w:t xml:space="preserve">Guttural stop (pharyngeal)</w:t>
+              <w:t xml:space="preserve">Pharyngeal stop</w:t>
             </w:r>
           </w:p>
         </w:tc>
@@ -1677,7 +1872,13 @@
               <w:t xml:space="preserve"> </w:t>
             </w:r>
             <w:r>
-              <w:t xml:space="preserve">‘paper’</w:t>
+              <w:t xml:space="preserve">‘</w:t>
+            </w:r>
+            <w:r>
+              <w:t xml:space="preserve">paper</w:t>
+            </w:r>
+            <w:r>
+              <w:t xml:space="preserve">’</w:t>
             </w:r>
           </w:p>
         </w:tc>
@@ -1757,19 +1958,25 @@
               <w:t xml:space="preserve"> </w:t>
             </w:r>
             <w:r>
-              <w:t xml:space="preserve">‘s’</w:t>
-            </w:r>
-            <w:r>
-              <w:t xml:space="preserve"> </w:t>
+              <w:t xml:space="preserve">‘</w:t>
+            </w:r>
+            <w:r>
+              <w:t xml:space="preserve">s</w:t>
+            </w:r>
+            <w:r>
+              <w:t xml:space="preserve">’</w:t>
             </w:r>
             <w:r>
               <w:t xml:space="preserve">/</w:t>
             </w:r>
             <w:r>
-              <w:t xml:space="preserve"> </w:t>
-            </w:r>
-            <w:r>
-              <w:t xml:space="preserve">‘ts’</w:t>
+              <w:t xml:space="preserve">‘</w:t>
+            </w:r>
+            <w:r>
+              <w:t xml:space="preserve">ts</w:t>
+            </w:r>
+            <w:r>
+              <w:t xml:space="preserve">’</w:t>
             </w:r>
           </w:p>
         </w:tc>
@@ -1843,13 +2050,19 @@
               <w:jc w:val="left"/>
             </w:pPr>
             <w:r>
-              <w:t xml:space="preserve">Guttural</w:t>
+              <w:t xml:space="preserve">Uvular</w:t>
             </w:r>
             <w:r>
               <w:t xml:space="preserve"> </w:t>
             </w:r>
             <w:r>
-              <w:t xml:space="preserve">‘k’</w:t>
+              <w:t xml:space="preserve">‘</w:t>
+            </w:r>
+            <w:r>
+              <w:t xml:space="preserve">k</w:t>
+            </w:r>
+            <w:r>
+              <w:t xml:space="preserve">’</w:t>
             </w:r>
           </w:p>
         </w:tc>
@@ -1929,7 +2142,13 @@
               <w:t xml:space="preserve"> </w:t>
             </w:r>
             <w:r>
-              <w:t xml:space="preserve">‘r’</w:t>
+              <w:t xml:space="preserve">‘</w:t>
+            </w:r>
+            <w:r>
+              <w:t xml:space="preserve">r</w:t>
+            </w:r>
+            <w:r>
+              <w:t xml:space="preserve">’</w:t>
             </w:r>
           </w:p>
         </w:tc>
@@ -2009,7 +2228,13 @@
               <w:t xml:space="preserve"> </w:t>
             </w:r>
             <w:r>
-              <w:t xml:space="preserve">‘she’</w:t>
+              <w:t xml:space="preserve">‘</w:t>
+            </w:r>
+            <w:r>
+              <w:t xml:space="preserve">she</w:t>
+            </w:r>
+            <w:r>
+              <w:t xml:space="preserve">’</w:t>
             </w:r>
           </w:p>
         </w:tc>
@@ -2089,7 +2314,13 @@
               <w:t xml:space="preserve"> </w:t>
             </w:r>
             <w:r>
-              <w:t xml:space="preserve">‘tall’</w:t>
+              <w:t xml:space="preserve">‘</w:t>
+            </w:r>
+            <w:r>
+              <w:t xml:space="preserve">tall</w:t>
+            </w:r>
+            <w:r>
+              <w:t xml:space="preserve">’</w:t>
             </w:r>
           </w:p>
         </w:tc>
@@ -2126,8 +2357,8 @@
         </w:pict>
       </w:r>
     </w:p>
-    <w:bookmarkEnd w:id="10"/>
-    <w:bookmarkStart w:id="11" w:name="section-3-joiners-vs.-non-joiners"/>
+    <w:bookmarkEnd w:id="21"/>
+    <w:bookmarkStart w:id="22" w:name="section-3-joiners-vs.-non-joiners"/>
     <w:p>
       <w:pPr>
         <w:pStyle w:val="Heading4"/>
@@ -2155,9 +2386,11 @@
         </w:rPr>
         <w:t xml:space="preserve">The Non-Joiners (Letters that only connect to the RIGHT):</w:t>
       </w:r>
-      <w:r>
-        <w:t xml:space="preserve"> </w:t>
-      </w:r>
+    </w:p>
+    <w:p>
+      <w:pPr>
+        <w:pStyle w:val="BodyText"/>
+      </w:pPr>
       <w:r>
         <w:t xml:space="preserve">ܐ (Alaph), ܕ (Dalath), ܗ (He), ܘ (Waw), ܙ (Zain), ܨ (Sade), ܪ (Rish), ܬ (Taw).</w:t>
       </w:r>
@@ -2181,8 +2414,8 @@
         </w:pict>
       </w:r>
     </w:p>
-    <w:bookmarkEnd w:id="11"/>
-    <w:bookmarkStart w:id="12" w:name="Xa7a666c9d07dd2d978697f56581b7ab5b4a5880"/>
+    <w:bookmarkEnd w:id="22"/>
+    <w:bookmarkStart w:id="23" w:name="Xa7a666c9d07dd2d978697f56581b7ab5b4a5880"/>
     <w:p>
       <w:pPr>
         <w:pStyle w:val="Heading4"/>
@@ -2195,6 +2428,7 @@
       <w:tblPr>
         <w:tblStyle w:val="Table"/>
         <w:tblW w:type="auto" w:w="0"/>
+        <w:jc w:val="left"/>
         <w:tblLook w:firstRow="1" w:lastRow="0" w:firstColumn="0" w:lastColumn="0" w:noHBand="0" w:noVBand="0" w:val="0020"/>
       </w:tblPr>
       <w:tblGrid>
@@ -2401,7 +2635,7 @@
               <w:jc w:val="left"/>
             </w:pPr>
             <w:r>
-              <w:t xml:space="preserve">Alaph (NJ) + Rish (NJ) + ʿE + Alaph</w:t>
+              <w:t xml:space="preserve">Alaph (NJ) + Rish (NJ) + ʿe + Alaph</w:t>
             </w:r>
           </w:p>
         </w:tc>
@@ -2514,8 +2748,8 @@
         </w:pict>
       </w:r>
     </w:p>
-    <w:bookmarkEnd w:id="12"/>
-    <w:bookmarkStart w:id="13" w:name="section-5-the-story-part-0"/>
+    <w:bookmarkEnd w:id="23"/>
+    <w:bookmarkStart w:id="24" w:name="section-5-the-story-part-0"/>
     <w:p>
       <w:pPr>
         <w:pStyle w:val="Heading4"/>
@@ -2538,7 +2772,37 @@
     </w:p>
     <w:p>
       <w:pPr>
-        <w:pStyle w:val="BodyText"/>
+        <w:pStyle w:val="BlockText"/>
+      </w:pPr>
+      <w:r>
+        <w:rPr>
+          <w:b/>
+          <w:bCs/>
+        </w:rPr>
+        <w:t xml:space="preserve">Note:</w:t>
+      </w:r>
+      <w:r>
+        <w:t xml:space="preserve"> </w:t>
+      </w:r>
+      <w:r>
+        <w:t xml:space="preserve">The story in this introductory lesson (</w:t>
+      </w:r>
+      <w:r>
+        <w:t xml:space="preserve">‘</w:t>
+      </w:r>
+      <w:r>
+        <w:t xml:space="preserve">The Scribe’s Beginning</w:t>
+      </w:r>
+      <w:r>
+        <w:t xml:space="preserve">’</w:t>
+      </w:r>
+      <w:r>
+        <w:t xml:space="preserve">) is a standalone narrative used to practice the alphabet. The main course narrative (The Acts of Mar Yukhannan) begins in Lesson 1.</w:t>
+      </w:r>
+    </w:p>
+    <w:p>
+      <w:pPr>
+        <w:pStyle w:val="FirstParagraph"/>
       </w:pPr>
       <w:r>
         <w:rPr>
@@ -2553,35 +2817,51 @@
         <w:pStyle w:val="BodyText"/>
       </w:pPr>
       <w:r>
-        <w:rPr>
-          <w:b/>
-          <w:bCs/>
-        </w:rPr>
-        <w:t xml:space="preserve">Sentence 1</w:t>
+        <w:t xml:space="preserve">ܐܢܐ ܥܕܝ ܣܦܪܐ</w:t>
       </w:r>
       <w:r>
         <w:t xml:space="preserve"> </w:t>
       </w:r>
       <w:r>
-        <w:t xml:space="preserve">ܐܢܐ ܥܕܝ ܣܦܪܐ</w:t>
+        <w:t xml:space="preserve">ʾenā ʿAdday sāp̄rā.</w:t>
       </w:r>
       <w:r>
         <w:t xml:space="preserve"> </w:t>
       </w:r>
       <w:r>
-        <w:t xml:space="preserve">ʾenā ʿAdday sāp̄rā.</w:t>
+        <w:t xml:space="preserve">ʾenā (I) ʿAdday (Addai) sāp̄rā (the-scribe)</w:t>
       </w:r>
       <w:r>
         <w:t xml:space="preserve"> </w:t>
       </w:r>
       <w:r>
-        <w:t xml:space="preserve">ʾenā (I) ʿAdday (Addai) sāp̄rā (the-scribe).</w:t>
+        <w:t xml:space="preserve">I am Addai the scribe.</w:t>
+      </w:r>
+    </w:p>
+    <w:p>
+      <w:pPr>
+        <w:pStyle w:val="BodyText"/>
+      </w:pPr>
+      <w:r>
+        <w:t xml:space="preserve">ܟܬܒ ܐܢܐ ܡܠܬܐ ܕܐܠܗܐ</w:t>
       </w:r>
       <w:r>
         <w:t xml:space="preserve"> </w:t>
       </w:r>
       <w:r>
-        <w:t xml:space="preserve">→ I am Addai the scribe.</w:t>
+        <w:t xml:space="preserve">kāteb ʾenā meltā d-Alāhā.</w:t>
+      </w:r>
+      <w:r>
+        <w:t xml:space="preserve"> </w:t>
+      </w:r>
+      <w:r>
+        <w:t xml:space="preserve">kāteb (writing) ʾenā (I) meltā (the-word) d- (of) Alāhā (God)</w:t>
+      </w:r>
+      <w:r>
+        <w:t xml:space="preserve"> </w:t>
+      </w:r>
+      <w:r>
+        <w:t xml:space="preserve">I am writing the word of God.</w:t>
       </w:r>
     </w:p>
     <w:p>
@@ -2589,71 +2869,25 @@
         <w:pStyle w:val="BodyText"/>
       </w:pPr>
       <w:r>
-        <w:rPr>
-          <w:b/>
-          <w:bCs/>
-        </w:rPr>
-        <w:t xml:space="preserve">Sentence 2</w:t>
+        <w:t xml:space="preserve">ܗܢܘ ܟܬܒܐ ܕܝܘܚܢܢ</w:t>
       </w:r>
       <w:r>
         <w:t xml:space="preserve"> </w:t>
       </w:r>
       <w:r>
-        <w:t xml:space="preserve">ܟܬܒ ܐܢܐ ܡܠܬܐ ܕܐܠܗܐ</w:t>
+        <w:t xml:space="preserve">hannū ktābā d-Yūḥannan.</w:t>
       </w:r>
       <w:r>
         <w:t xml:space="preserve"> </w:t>
       </w:r>
       <w:r>
-        <w:t xml:space="preserve">kāteb ʾenā meltā d-Alāhā.</w:t>
+        <w:t xml:space="preserve">hannū (this-is) ktābā (the-writing/book) d- (of) Yūḥannan (John)</w:t>
       </w:r>
       <w:r>
         <w:t xml:space="preserve"> </w:t>
       </w:r>
       <w:r>
-        <w:t xml:space="preserve">kāteb (writing) ʾenā (I) meltā (the-word) d- (of) Alāhā (God).</w:t>
-      </w:r>
-      <w:r>
-        <w:t xml:space="preserve"> </w:t>
-      </w:r>
-      <w:r>
-        <w:t xml:space="preserve">→ I am writing the word of God.</w:t>
-      </w:r>
-    </w:p>
-    <w:p>
-      <w:pPr>
-        <w:pStyle w:val="BodyText"/>
-      </w:pPr>
-      <w:r>
-        <w:rPr>
-          <w:b/>
-          <w:bCs/>
-        </w:rPr>
-        <w:t xml:space="preserve">Sentence 3</w:t>
-      </w:r>
-      <w:r>
-        <w:t xml:space="preserve"> </w:t>
-      </w:r>
-      <w:r>
-        <w:t xml:space="preserve">ܗܢܘ ܟܬܒܐ ܕܝܘܚܢܢ</w:t>
-      </w:r>
-      <w:r>
-        <w:t xml:space="preserve"> </w:t>
-      </w:r>
-      <w:r>
-        <w:t xml:space="preserve">hannū ktābā d-Yūḥannan.</w:t>
-      </w:r>
-      <w:r>
-        <w:t xml:space="preserve"> </w:t>
-      </w:r>
-      <w:r>
-        <w:t xml:space="preserve">hannū (this-is) ktābā (the-writing/book) d- (of) Yūḥannan (John).</w:t>
-      </w:r>
-      <w:r>
-        <w:t xml:space="preserve"> </w:t>
-      </w:r>
-      <w:r>
-        <w:t xml:space="preserve">→ This is the book of Yukhannan.</w:t>
+        <w:t xml:space="preserve">This is the book of Yukhannan.</w:t>
       </w:r>
     </w:p>
     <w:p>
@@ -2663,8 +2897,8 @@
         </w:pict>
       </w:r>
     </w:p>
-    <w:bookmarkEnd w:id="13"/>
-    <w:bookmarkStart w:id="14" w:name="section-6-exercises"/>
+    <w:bookmarkEnd w:id="24"/>
+    <w:bookmarkStart w:id="25" w:name="section-6-exercises"/>
     <w:p>
       <w:pPr>
         <w:pStyle w:val="Heading4"/>
@@ -2684,34 +2918,54 @@
         </w:rPr>
         <w:t xml:space="preserve">Exercise 1: Alphabet Order</w:t>
       </w:r>
-      <w:r>
-        <w:t xml:space="preserve"> </w:t>
-      </w:r>
+    </w:p>
+    <w:p>
+      <w:pPr>
+        <w:pStyle w:val="BodyText"/>
+      </w:pPr>
       <w:r>
         <w:t xml:space="preserve">Write the following three letters in their Abgad sequence (the order used in the table in Section 2).</w:t>
       </w:r>
-      <w:r>
-        <w:t xml:space="preserve"> </w:t>
-      </w:r>
-      <w:r>
-        <w:t xml:space="preserve">1. ܓ , ܐ , ܒ</w:t>
-      </w:r>
-      <w:r>
-        <w:t xml:space="preserve"> </w:t>
-      </w:r>
-      <w:r>
-        <w:t xml:space="preserve">2. ܝ , ܚ , ܛ</w:t>
-      </w:r>
-      <w:r>
-        <w:t xml:space="preserve"> </w:t>
-      </w:r>
-      <w:r>
-        <w:t xml:space="preserve">3. ܪ , ܩ , ܫ</w:t>
-      </w:r>
-    </w:p>
-    <w:p>
-      <w:pPr>
-        <w:pStyle w:val="BodyText"/>
+    </w:p>
+    <w:p>
+      <w:pPr>
+        <w:pStyle w:val="Compact"/>
+        <w:numPr>
+          <w:ilvl w:val="0"/>
+          <w:numId w:val="1002"/>
+        </w:numPr>
+      </w:pPr>
+      <w:r>
+        <w:t xml:space="preserve">ܓ , ܐ , ܒ</w:t>
+      </w:r>
+    </w:p>
+    <w:p>
+      <w:pPr>
+        <w:pStyle w:val="Compact"/>
+        <w:numPr>
+          <w:ilvl w:val="0"/>
+          <w:numId w:val="1002"/>
+        </w:numPr>
+      </w:pPr>
+      <w:r>
+        <w:t xml:space="preserve">ܝ , ܚ , ܛ</w:t>
+      </w:r>
+    </w:p>
+    <w:p>
+      <w:pPr>
+        <w:pStyle w:val="Compact"/>
+        <w:numPr>
+          <w:ilvl w:val="0"/>
+          <w:numId w:val="1002"/>
+        </w:numPr>
+      </w:pPr>
+      <w:r>
+        <w:t xml:space="preserve">ܪ , ܩ , ܫ</w:t>
+      </w:r>
+    </w:p>
+    <w:p>
+      <w:pPr>
+        <w:pStyle w:val="FirstParagraph"/>
       </w:pPr>
       <w:r>
         <w:rPr>
@@ -2720,9 +2974,11 @@
         </w:rPr>
         <w:t xml:space="preserve">Exercise 2: Identify the Non-Joiners</w:t>
       </w:r>
-      <w:r>
-        <w:t xml:space="preserve"> </w:t>
-      </w:r>
+    </w:p>
+    <w:p>
+      <w:pPr>
+        <w:pStyle w:val="BodyText"/>
+      </w:pPr>
       <w:r>
         <w:t xml:space="preserve">In the word</w:t>
       </w:r>
@@ -2754,34 +3010,54 @@
         </w:rPr>
         <w:t xml:space="preserve">Exercise 3: Transcription Practice</w:t>
       </w:r>
-      <w:r>
-        <w:t xml:space="preserve"> </w:t>
-      </w:r>
+    </w:p>
+    <w:p>
+      <w:pPr>
+        <w:pStyle w:val="BodyText"/>
+      </w:pPr>
       <w:r>
         <w:t xml:space="preserve">Write out the Syriac letters for the following names based on Section 2:</w:t>
       </w:r>
-      <w:r>
-        <w:t xml:space="preserve"> </w:t>
-      </w:r>
-      <w:r>
-        <w:t xml:space="preserve">1. M-L-K-A (King)</w:t>
-      </w:r>
-      <w:r>
-        <w:t xml:space="preserve"> </w:t>
-      </w:r>
-      <w:r>
-        <w:t xml:space="preserve">2. A-L-H-A (God)</w:t>
-      </w:r>
-      <w:r>
-        <w:t xml:space="preserve"> </w:t>
-      </w:r>
-      <w:r>
-        <w:t xml:space="preserve">3. Y-W-H-N-N (Yukhannan / John)</w:t>
-      </w:r>
-    </w:p>
-    <w:p>
-      <w:pPr>
-        <w:pStyle w:val="BodyText"/>
+    </w:p>
+    <w:p>
+      <w:pPr>
+        <w:pStyle w:val="Compact"/>
+        <w:numPr>
+          <w:ilvl w:val="0"/>
+          <w:numId w:val="1003"/>
+        </w:numPr>
+      </w:pPr>
+      <w:r>
+        <w:t xml:space="preserve">M-L-K-A (King)</w:t>
+      </w:r>
+    </w:p>
+    <w:p>
+      <w:pPr>
+        <w:pStyle w:val="Compact"/>
+        <w:numPr>
+          <w:ilvl w:val="0"/>
+          <w:numId w:val="1003"/>
+        </w:numPr>
+      </w:pPr>
+      <w:r>
+        <w:t xml:space="preserve">A-L-H-A (God)</w:t>
+      </w:r>
+    </w:p>
+    <w:p>
+      <w:pPr>
+        <w:pStyle w:val="Compact"/>
+        <w:numPr>
+          <w:ilvl w:val="0"/>
+          <w:numId w:val="1003"/>
+        </w:numPr>
+      </w:pPr>
+      <w:r>
+        <w:t xml:space="preserve">Y-W-H-N-N (Yukhannan / John)</w:t>
+      </w:r>
+    </w:p>
+    <w:p>
+      <w:pPr>
+        <w:pStyle w:val="FirstParagraph"/>
       </w:pPr>
       <w:r>
         <w:rPr>
@@ -2790,9 +3066,11 @@
         </w:rPr>
         <w:t xml:space="preserve">Exercise 4: Directional Awareness</w:t>
       </w:r>
-      <w:r>
-        <w:t xml:space="preserve"> </w:t>
-      </w:r>
+    </w:p>
+    <w:p>
+      <w:pPr>
+        <w:pStyle w:val="BodyText"/>
+      </w:pPr>
       <w:r>
         <w:t xml:space="preserve">If you are reading the word</w:t>
       </w:r>
@@ -2817,8 +3095,8 @@
         </w:pict>
       </w:r>
     </w:p>
-    <w:bookmarkEnd w:id="14"/>
-    <w:bookmarkStart w:id="15" w:name="section-7-answer-key"/>
+    <w:bookmarkEnd w:id="25"/>
+    <w:bookmarkStart w:id="26" w:name="section-7-answer-key"/>
     <w:p>
       <w:pPr>
         <w:pStyle w:val="Heading4"/>
@@ -2838,28 +3116,46 @@
         </w:rPr>
         <w:t xml:space="preserve">Exercise 1</w:t>
       </w:r>
-      <w:r>
-        <w:t xml:space="preserve"> </w:t>
-      </w:r>
-      <w:r>
-        <w:t xml:space="preserve">1. ܐ , ܒ , ܓ (A-B-G)</w:t>
-      </w:r>
-      <w:r>
-        <w:t xml:space="preserve"> </w:t>
-      </w:r>
-      <w:r>
-        <w:t xml:space="preserve">2. ܚ , ܛ , ܝ (H-T-Y)</w:t>
-      </w:r>
-      <w:r>
-        <w:t xml:space="preserve"> </w:t>
-      </w:r>
-      <w:r>
-        <w:t xml:space="preserve">3. ܩ , ܪ , ܫ (Q-R-S)</w:t>
-      </w:r>
-    </w:p>
-    <w:p>
-      <w:pPr>
-        <w:pStyle w:val="BodyText"/>
+    </w:p>
+    <w:p>
+      <w:pPr>
+        <w:pStyle w:val="Compact"/>
+        <w:numPr>
+          <w:ilvl w:val="0"/>
+          <w:numId w:val="1004"/>
+        </w:numPr>
+      </w:pPr>
+      <w:r>
+        <w:t xml:space="preserve">ܐ , ܒ , ܓ (A-B-G)</w:t>
+      </w:r>
+    </w:p>
+    <w:p>
+      <w:pPr>
+        <w:pStyle w:val="Compact"/>
+        <w:numPr>
+          <w:ilvl w:val="0"/>
+          <w:numId w:val="1004"/>
+        </w:numPr>
+      </w:pPr>
+      <w:r>
+        <w:t xml:space="preserve">ܚ , ܛ , ܝ (H-T-Y)</w:t>
+      </w:r>
+    </w:p>
+    <w:p>
+      <w:pPr>
+        <w:pStyle w:val="Compact"/>
+        <w:numPr>
+          <w:ilvl w:val="0"/>
+          <w:numId w:val="1004"/>
+        </w:numPr>
+      </w:pPr>
+      <w:r>
+        <w:t xml:space="preserve">ܩ , ܪ , ܫ (Q-R-S)</w:t>
+      </w:r>
+    </w:p>
+    <w:p>
+      <w:pPr>
+        <w:pStyle w:val="FirstParagraph"/>
       </w:pPr>
       <w:r>
         <w:rPr>
@@ -2868,9 +3164,11 @@
         </w:rPr>
         <w:t xml:space="preserve">Exercise 2</w:t>
       </w:r>
-      <w:r>
-        <w:t xml:space="preserve"> </w:t>
-      </w:r>
+    </w:p>
+    <w:p>
+      <w:pPr>
+        <w:pStyle w:val="BodyText"/>
+      </w:pPr>
       <w:r>
         <w:t xml:space="preserve">ܘ (Waw), ܗ (He), ܪ (Rish), ܐ (Alaph). All of these stop the cursive connection.</w:t>
       </w:r>
@@ -2886,28 +3184,46 @@
         </w:rPr>
         <w:t xml:space="preserve">Exercise 3</w:t>
       </w:r>
-      <w:r>
-        <w:t xml:space="preserve"> </w:t>
-      </w:r>
-      <w:r>
-        <w:t xml:space="preserve">1. ܡܠܟܐ</w:t>
-      </w:r>
-      <w:r>
-        <w:t xml:space="preserve"> </w:t>
-      </w:r>
-      <w:r>
-        <w:t xml:space="preserve">2. ܐܠܗܐ</w:t>
-      </w:r>
-      <w:r>
-        <w:t xml:space="preserve"> </w:t>
-      </w:r>
-      <w:r>
-        <w:t xml:space="preserve">3. ܝܘܚܢܢ</w:t>
-      </w:r>
-    </w:p>
-    <w:p>
-      <w:pPr>
-        <w:pStyle w:val="BodyText"/>
+    </w:p>
+    <w:p>
+      <w:pPr>
+        <w:pStyle w:val="Compact"/>
+        <w:numPr>
+          <w:ilvl w:val="0"/>
+          <w:numId w:val="1005"/>
+        </w:numPr>
+      </w:pPr>
+      <w:r>
+        <w:t xml:space="preserve">ܡܠܟܐ</w:t>
+      </w:r>
+    </w:p>
+    <w:p>
+      <w:pPr>
+        <w:pStyle w:val="Compact"/>
+        <w:numPr>
+          <w:ilvl w:val="0"/>
+          <w:numId w:val="1005"/>
+        </w:numPr>
+      </w:pPr>
+      <w:r>
+        <w:t xml:space="preserve">ܐܠܗܐ</w:t>
+      </w:r>
+    </w:p>
+    <w:p>
+      <w:pPr>
+        <w:pStyle w:val="Compact"/>
+        <w:numPr>
+          <w:ilvl w:val="0"/>
+          <w:numId w:val="1005"/>
+        </w:numPr>
+      </w:pPr>
+      <w:r>
+        <w:t xml:space="preserve">ܝܘܚܢܢ</w:t>
+      </w:r>
+    </w:p>
+    <w:p>
+      <w:pPr>
+        <w:pStyle w:val="FirstParagraph"/>
       </w:pPr>
       <w:r>
         <w:rPr>
@@ -2916,9 +3232,11 @@
         </w:rPr>
         <w:t xml:space="preserve">Exercise 4</w:t>
       </w:r>
-      <w:r>
-        <w:t xml:space="preserve"> </w:t>
-      </w:r>
+    </w:p>
+    <w:p>
+      <w:pPr>
+        <w:pStyle w:val="BodyText"/>
+      </w:pPr>
       <w:r>
         <w:t xml:space="preserve">The letter on the far RIGHT (ܐ - Alaph).</w:t>
       </w:r>
@@ -2930,8 +3248,8 @@
         </w:pict>
       </w:r>
     </w:p>
-    <w:bookmarkEnd w:id="15"/>
-    <w:bookmarkStart w:id="16" w:name="section-8-additional-vocabulary"/>
+    <w:bookmarkEnd w:id="26"/>
+    <w:bookmarkStart w:id="27" w:name="section-8-additional-vocabulary"/>
     <w:p>
       <w:pPr>
         <w:pStyle w:val="Heading4"/>
@@ -2945,13 +3263,14 @@
         <w:pStyle w:val="FirstParagraph"/>
       </w:pPr>
       <w:r>
-        <w:t xml:space="preserve">To bring this introductory lesson to 30 words (including the alphabet names):</w:t>
+        <w:t xml:space="preserve">The 22 letter names learned in Section 2 (Alaph, Beth, Gamal … Taw) count as the first 22 vocabulary items of this lesson. The 8 words below complete the set of 30, all drawn from the world of scribal culture that frames this course.</w:t>
       </w:r>
     </w:p>
     <w:tbl>
       <w:tblPr>
         <w:tblStyle w:val="Table"/>
         <w:tblW w:type="auto" w:w="0"/>
+        <w:jc w:val="left"/>
         <w:tblLook w:firstRow="1" w:lastRow="0" w:firstColumn="0" w:lastColumn="0" w:noHBand="0" w:noVBand="0" w:val="0020"/>
       </w:tblPr>
       <w:tblGrid>
@@ -3058,7 +3377,13 @@
               <w:jc w:val="left"/>
             </w:pPr>
             <w:r>
-              <w:t xml:space="preserve">“Rounded”</w:t>
+              <w:t xml:space="preserve">“</w:t>
+            </w:r>
+            <w:r>
+              <w:t xml:space="preserve">Rounded</w:t>
+            </w:r>
+            <w:r>
+              <w:t xml:space="preserve">”</w:t>
             </w:r>
             <w:r>
               <w:t xml:space="preserve"> </w:t>
@@ -3420,15 +3745,9 @@
         </w:tc>
       </w:tr>
     </w:tbl>
-    <w:bookmarkEnd w:id="16"/>
-    <w:bookmarkEnd w:id="17"/>
-    <w:bookmarkEnd w:id="18"/>
-    <w:bookmarkEnd w:id="19"/>
-    <w:sectPr>
-      <w:footnotePr>
-        <w:numRestart w:val="eachSect"/>
-      </w:footnotePr>
-    </w:sectPr>
+    <w:bookmarkEnd w:id="27"/>
+    <w:bookmarkEnd w:id="28"/>
+    <w:sectPr/>
   </w:body>
 </w:document>
 </file>
@@ -3466,7 +3785,7 @@
       <w:lvlText w:val=" "/>
       <w:lvlJc w:val="left"/>
       <w:pPr>
-        <w:ind w:left="720" w:hanging="360"/>
+        <w:ind w:left="720" w:hanging="480"/>
       </w:pPr>
     </w:lvl>
     <w:lvl w:ilvl="1">
@@ -3474,7 +3793,7 @@
       <w:lvlText w:val=" "/>
       <w:lvlJc w:val="left"/>
       <w:pPr>
-        <w:ind w:left="1440" w:hanging="360"/>
+        <w:ind w:left="1440" w:hanging="480"/>
       </w:pPr>
     </w:lvl>
     <w:lvl w:ilvl="2">
@@ -3482,7 +3801,7 @@
       <w:lvlText w:val=" "/>
       <w:lvlJc w:val="left"/>
       <w:pPr>
-        <w:ind w:left="2160" w:hanging="360"/>
+        <w:ind w:left="2160" w:hanging="480"/>
       </w:pPr>
     </w:lvl>
     <w:lvl w:ilvl="3">
@@ -3490,7 +3809,7 @@
       <w:lvlText w:val=" "/>
       <w:lvlJc w:val="left"/>
       <w:pPr>
-        <w:ind w:left="2880" w:hanging="360"/>
+        <w:ind w:left="2880" w:hanging="480"/>
       </w:pPr>
     </w:lvl>
     <w:lvl w:ilvl="4">
@@ -3498,7 +3817,7 @@
       <w:lvlText w:val=" "/>
       <w:lvlJc w:val="left"/>
       <w:pPr>
-        <w:ind w:left="3600" w:hanging="360"/>
+        <w:ind w:left="3600" w:hanging="480"/>
       </w:pPr>
     </w:lvl>
     <w:lvl w:ilvl="5">
@@ -3506,7 +3825,7 @@
       <w:lvlText w:val=" "/>
       <w:lvlJc w:val="left"/>
       <w:pPr>
-        <w:ind w:left="4320" w:hanging="360"/>
+        <w:ind w:left="4320" w:hanging="480"/>
       </w:pPr>
     </w:lvl>
     <w:lvl w:ilvl="6">
@@ -3514,7 +3833,7 @@
       <w:lvlText w:val=" "/>
       <w:lvlJc w:val="left"/>
       <w:pPr>
-        <w:ind w:left="5040" w:hanging="360"/>
+        <w:ind w:left="5040" w:hanging="480"/>
       </w:pPr>
     </w:lvl>
     <w:lvl w:ilvl="7">
@@ -3522,7 +3841,7 @@
       <w:lvlText w:val=" "/>
       <w:lvlJc w:val="left"/>
       <w:pPr>
-        <w:ind w:left="5760" w:hanging="360"/>
+        <w:ind w:left="5760" w:hanging="480"/>
       </w:pPr>
     </w:lvl>
     <w:lvl w:ilvl="8">
@@ -3530,12 +3849,247 @@
       <w:lvlText w:val=" "/>
       <w:lvlJc w:val="left"/>
       <w:pPr>
-        <w:ind w:left="6480" w:hanging="360"/>
+        <w:ind w:left="6480" w:hanging="480"/>
+      </w:pPr>
+    </w:lvl>
+  </w:abstractNum>
+  <w:abstractNum w:abstractNumId="99411">
+    <w:nsid w:val="00A99411"/>
+    <w:multiLevelType w:val="multilevel"/>
+    <w:lvl w:ilvl="0">
+      <w:start w:val="1"/>
+      <w:numFmt w:val="decimal"/>
+      <w:lvlText w:val="%1."/>
+      <w:lvlJc w:val="left"/>
+      <w:pPr>
+        <w:ind w:left="720" w:hanging="480"/>
+      </w:pPr>
+    </w:lvl>
+    <w:lvl w:ilvl="1">
+      <w:start w:val="1"/>
+      <w:numFmt w:val="decimal"/>
+      <w:lvlText w:val="%2."/>
+      <w:lvlJc w:val="left"/>
+      <w:pPr>
+        <w:ind w:left="1440" w:hanging="480"/>
+      </w:pPr>
+    </w:lvl>
+    <w:lvl w:ilvl="2">
+      <w:start w:val="1"/>
+      <w:numFmt w:val="decimal"/>
+      <w:lvlText w:val="%3."/>
+      <w:lvlJc w:val="left"/>
+      <w:pPr>
+        <w:ind w:left="2160" w:hanging="480"/>
+      </w:pPr>
+    </w:lvl>
+    <w:lvl w:ilvl="3">
+      <w:start w:val="1"/>
+      <w:numFmt w:val="decimal"/>
+      <w:lvlText w:val="%4."/>
+      <w:lvlJc w:val="left"/>
+      <w:pPr>
+        <w:ind w:left="2880" w:hanging="480"/>
+      </w:pPr>
+    </w:lvl>
+    <w:lvl w:ilvl="4">
+      <w:start w:val="1"/>
+      <w:numFmt w:val="decimal"/>
+      <w:lvlText w:val="%5."/>
+      <w:lvlJc w:val="left"/>
+      <w:pPr>
+        <w:ind w:left="3600" w:hanging="480"/>
+      </w:pPr>
+    </w:lvl>
+    <w:lvl w:ilvl="5">
+      <w:start w:val="1"/>
+      <w:numFmt w:val="decimal"/>
+      <w:lvlText w:val="%6."/>
+      <w:lvlJc w:val="left"/>
+      <w:pPr>
+        <w:ind w:left="4320" w:hanging="480"/>
+      </w:pPr>
+    </w:lvl>
+    <w:lvl w:ilvl="6">
+      <w:start w:val="1"/>
+      <w:numFmt w:val="decimal"/>
+      <w:lvlText w:val="%7."/>
+      <w:lvlJc w:val="left"/>
+      <w:pPr>
+        <w:ind w:left="5040" w:hanging="480"/>
+      </w:pPr>
+    </w:lvl>
+    <w:lvl w:ilvl="7">
+      <w:start w:val="1"/>
+      <w:numFmt w:val="decimal"/>
+      <w:lvlText w:val="%8."/>
+      <w:lvlJc w:val="left"/>
+      <w:pPr>
+        <w:ind w:left="5760" w:hanging="480"/>
+      </w:pPr>
+    </w:lvl>
+    <w:lvl w:ilvl="8">
+      <w:start w:val="1"/>
+      <w:numFmt w:val="decimal"/>
+      <w:lvlText w:val="%9."/>
+      <w:lvlJc w:val="left"/>
+      <w:pPr>
+        <w:ind w:left="6480" w:hanging="480"/>
       </w:pPr>
     </w:lvl>
   </w:abstractNum>
   <w:num w:numId="1000">
     <w:abstractNumId w:val="990"/>
+  </w:num>
+  <w:num w:numId="1001">
+    <w:abstractNumId w:val="99411"/>
+    <w:lvlOverride w:ilvl="0">
+      <w:startOverride w:val="1"/>
+    </w:lvlOverride>
+    <w:lvlOverride w:ilvl="1">
+      <w:startOverride w:val="1"/>
+    </w:lvlOverride>
+    <w:lvlOverride w:ilvl="2">
+      <w:startOverride w:val="1"/>
+    </w:lvlOverride>
+    <w:lvlOverride w:ilvl="3">
+      <w:startOverride w:val="1"/>
+    </w:lvlOverride>
+    <w:lvlOverride w:ilvl="4">
+      <w:startOverride w:val="1"/>
+    </w:lvlOverride>
+    <w:lvlOverride w:ilvl="5">
+      <w:startOverride w:val="1"/>
+    </w:lvlOverride>
+    <w:lvlOverride w:ilvl="6">
+      <w:startOverride w:val="1"/>
+    </w:lvlOverride>
+    <w:lvlOverride w:ilvl="7">
+      <w:startOverride w:val="1"/>
+    </w:lvlOverride>
+    <w:lvlOverride w:ilvl="8">
+      <w:startOverride w:val="1"/>
+    </w:lvlOverride>
+  </w:num>
+  <w:num w:numId="1002">
+    <w:abstractNumId w:val="99411"/>
+    <w:lvlOverride w:ilvl="0">
+      <w:startOverride w:val="1"/>
+    </w:lvlOverride>
+    <w:lvlOverride w:ilvl="1">
+      <w:startOverride w:val="1"/>
+    </w:lvlOverride>
+    <w:lvlOverride w:ilvl="2">
+      <w:startOverride w:val="1"/>
+    </w:lvlOverride>
+    <w:lvlOverride w:ilvl="3">
+      <w:startOverride w:val="1"/>
+    </w:lvlOverride>
+    <w:lvlOverride w:ilvl="4">
+      <w:startOverride w:val="1"/>
+    </w:lvlOverride>
+    <w:lvlOverride w:ilvl="5">
+      <w:startOverride w:val="1"/>
+    </w:lvlOverride>
+    <w:lvlOverride w:ilvl="6">
+      <w:startOverride w:val="1"/>
+    </w:lvlOverride>
+    <w:lvlOverride w:ilvl="7">
+      <w:startOverride w:val="1"/>
+    </w:lvlOverride>
+    <w:lvlOverride w:ilvl="8">
+      <w:startOverride w:val="1"/>
+    </w:lvlOverride>
+  </w:num>
+  <w:num w:numId="1003">
+    <w:abstractNumId w:val="99411"/>
+    <w:lvlOverride w:ilvl="0">
+      <w:startOverride w:val="1"/>
+    </w:lvlOverride>
+    <w:lvlOverride w:ilvl="1">
+      <w:startOverride w:val="1"/>
+    </w:lvlOverride>
+    <w:lvlOverride w:ilvl="2">
+      <w:startOverride w:val="1"/>
+    </w:lvlOverride>
+    <w:lvlOverride w:ilvl="3">
+      <w:startOverride w:val="1"/>
+    </w:lvlOverride>
+    <w:lvlOverride w:ilvl="4">
+      <w:startOverride w:val="1"/>
+    </w:lvlOverride>
+    <w:lvlOverride w:ilvl="5">
+      <w:startOverride w:val="1"/>
+    </w:lvlOverride>
+    <w:lvlOverride w:ilvl="6">
+      <w:startOverride w:val="1"/>
+    </w:lvlOverride>
+    <w:lvlOverride w:ilvl="7">
+      <w:startOverride w:val="1"/>
+    </w:lvlOverride>
+    <w:lvlOverride w:ilvl="8">
+      <w:startOverride w:val="1"/>
+    </w:lvlOverride>
+  </w:num>
+  <w:num w:numId="1004">
+    <w:abstractNumId w:val="99411"/>
+    <w:lvlOverride w:ilvl="0">
+      <w:startOverride w:val="1"/>
+    </w:lvlOverride>
+    <w:lvlOverride w:ilvl="1">
+      <w:startOverride w:val="1"/>
+    </w:lvlOverride>
+    <w:lvlOverride w:ilvl="2">
+      <w:startOverride w:val="1"/>
+    </w:lvlOverride>
+    <w:lvlOverride w:ilvl="3">
+      <w:startOverride w:val="1"/>
+    </w:lvlOverride>
+    <w:lvlOverride w:ilvl="4">
+      <w:startOverride w:val="1"/>
+    </w:lvlOverride>
+    <w:lvlOverride w:ilvl="5">
+      <w:startOverride w:val="1"/>
+    </w:lvlOverride>
+    <w:lvlOverride w:ilvl="6">
+      <w:startOverride w:val="1"/>
+    </w:lvlOverride>
+    <w:lvlOverride w:ilvl="7">
+      <w:startOverride w:val="1"/>
+    </w:lvlOverride>
+    <w:lvlOverride w:ilvl="8">
+      <w:startOverride w:val="1"/>
+    </w:lvlOverride>
+  </w:num>
+  <w:num w:numId="1005">
+    <w:abstractNumId w:val="99411"/>
+    <w:lvlOverride w:ilvl="0">
+      <w:startOverride w:val="1"/>
+    </w:lvlOverride>
+    <w:lvlOverride w:ilvl="1">
+      <w:startOverride w:val="1"/>
+    </w:lvlOverride>
+    <w:lvlOverride w:ilvl="2">
+      <w:startOverride w:val="1"/>
+    </w:lvlOverride>
+    <w:lvlOverride w:ilvl="3">
+      <w:startOverride w:val="1"/>
+    </w:lvlOverride>
+    <w:lvlOverride w:ilvl="4">
+      <w:startOverride w:val="1"/>
+    </w:lvlOverride>
+    <w:lvlOverride w:ilvl="5">
+      <w:startOverride w:val="1"/>
+    </w:lvlOverride>
+    <w:lvlOverride w:ilvl="6">
+      <w:startOverride w:val="1"/>
+    </w:lvlOverride>
+    <w:lvlOverride w:ilvl="7">
+      <w:startOverride w:val="1"/>
+    </w:lvlOverride>
+    <w:lvlOverride w:ilvl="8">
+      <w:startOverride w:val="1"/>
+    </w:lvlOverride>
   </w:num>
 </w:numbering>
 </file>
@@ -3545,10 +4099,10 @@
   <w:docDefaults>
     <w:rPrDefault>
       <w:rPr>
-        <w:rFonts w:asciiTheme="minorHAnsi" w:cstheme="minorBidi" w:eastAsiaTheme="minorEastAsia" w:hAnsiTheme="minorHAnsi"/>
+        <w:rFonts w:asciiTheme="minorHAnsi" w:cstheme="minorBidi" w:eastAsiaTheme="minorHAnsi" w:hAnsiTheme="minorHAnsi"/>
         <w:sz w:val="24"/>
         <w:szCs w:val="24"/>
-        <w:lang w:bidi="ar-SA" w:eastAsia="zh-CN" w:val="en-US"/>
+        <w:lang w:bidi="ar-SA" w:eastAsia="en-US" w:val="en-US"/>
       </w:rPr>
     </w:rPrDefault>
     <w:pPrDefault>
@@ -3589,94 +4143,57 @@
     <w:name w:val="Title"/>
     <w:basedOn w:val="Normal"/>
     <w:next w:val="BodyText"/>
-    <w:link w:val="TitleChar"/>
-    <w:uiPriority w:val="10"/>
     <w:qFormat/>
-    <w:rsid w:val="00A10FD9"/>
     <w:pPr>
-      <w:spacing w:after="80" w:line="240" w:lineRule="auto"/>
-      <w:contextualSpacing/>
+      <w:keepNext/>
+      <w:keepLines/>
+      <w:spacing w:after="240" w:before="480"/>
       <w:jc w:val="center"/>
     </w:pPr>
     <w:rPr>
       <w:rFonts w:asciiTheme="majorHAnsi" w:cstheme="majorBidi" w:eastAsiaTheme="majorEastAsia" w:hAnsiTheme="majorHAnsi"/>
-      <w:sz w:val="56"/>
-      <w:szCs w:val="56"/>
-    </w:rPr>
-  </w:style>
-  <w:style w:customStyle="1" w:styleId="TitleChar" w:type="character">
-    <w:name w:val="Title Char"/>
-    <w:basedOn w:val="DefaultParagraphFont"/>
-    <w:link w:val="Title"/>
-    <w:uiPriority w:val="10"/>
-    <w:rsid w:val="00A10FD9"/>
-    <w:rPr>
-      <w:rFonts w:asciiTheme="majorHAnsi" w:cstheme="majorBidi" w:eastAsiaTheme="majorEastAsia" w:hAnsiTheme="majorHAnsi"/>
-      <w:sz w:val="56"/>
-      <w:szCs w:val="56"/>
+      <w:b/>
+      <w:bCs/>
+      <w:color w:themeColor="accent1" w:themeShade="B5" w:val="345A8A"/>
+      <w:sz w:val="36"/>
+      <w:szCs w:val="36"/>
     </w:rPr>
   </w:style>
   <w:style w:styleId="Subtitle" w:type="paragraph">
     <w:name w:val="Subtitle"/>
-    <w:basedOn w:val="Title"/>
-    <w:next w:val="BodyText"/>
-    <w:link w:val="SubtitleChar"/>
-    <w:uiPriority w:val="11"/>
-    <w:qFormat/>
-    <w:rsid w:val="00A10FD9"/>
-    <w:pPr>
-      <w:numPr>
-        <w:ilvl w:val="1"/>
-      </w:numPr>
-    </w:pPr>
-    <w:rPr>
-      <w:rFonts w:cstheme="majorBidi" w:eastAsiaTheme="majorEastAsia"/>
-      <w:spacing w:val="15"/>
-      <w:sz w:val="28"/>
-      <w:szCs w:val="28"/>
-    </w:rPr>
-  </w:style>
-  <w:style w:customStyle="1" w:styleId="SubtitleChar" w:type="character">
-    <w:name w:val="Subtitle Char"/>
-    <w:basedOn w:val="DefaultParagraphFont"/>
-    <w:link w:val="Subtitle"/>
-    <w:uiPriority w:val="11"/>
-    <w:rsid w:val="00A10FD9"/>
-    <w:rPr>
-      <w:rFonts w:cstheme="majorBidi" w:eastAsiaTheme="majorEastAsia"/>
-      <w:color w:themeColor="text1" w:themeTint="A6" w:val="595959"/>
-      <w:spacing w:val="15"/>
-      <w:sz w:val="28"/>
-      <w:szCs w:val="28"/>
-    </w:rPr>
-  </w:style>
-  <w:style w:customStyle="1" w:styleId="Author" w:type="paragraph">
-    <w:name w:val="Author"/>
     <w:basedOn w:val="Title"/>
     <w:next w:val="BodyText"/>
     <w:qFormat/>
     <w:pPr>
       <w:keepNext/>
       <w:keepLines/>
+      <w:spacing w:after="240" w:before="240"/>
+      <w:jc w:val="center"/>
     </w:pPr>
     <w:rPr>
-      <w:sz w:val="24"/>
-      <w:szCs w:val="24"/>
+      <w:sz w:val="30"/>
+      <w:szCs w:val="30"/>
     </w:rPr>
   </w:style>
-  <w:style w:styleId="Date" w:type="paragraph">
-    <w:name w:val="Date"/>
-    <w:basedOn w:val="Title"/>
+  <w:style w:customStyle="1" w:styleId="Author" w:type="paragraph">
+    <w:name w:val="Author"/>
     <w:next w:val="BodyText"/>
     <w:qFormat/>
     <w:pPr>
       <w:keepNext/>
       <w:keepLines/>
+      <w:jc w:val="center"/>
     </w:pPr>
-    <w:rPr>
-      <w:sz w:val="24"/>
-      <w:szCs w:val="24"/>
-    </w:rPr>
+  </w:style>
+  <w:style w:styleId="Date" w:type="paragraph">
+    <w:name w:val="Date"/>
+    <w:next w:val="BodyText"/>
+    <w:qFormat/>
+    <w:pPr>
+      <w:keepNext/>
+      <w:keepLines/>
+      <w:jc w:val="center"/>
+    </w:pPr>
   </w:style>
   <w:style w:customStyle="1" w:styleId="AbstractTitle" w:type="paragraph">
     <w:name w:val="Abstract Title"/>
@@ -3691,6 +4208,7 @@
     </w:pPr>
     <w:rPr>
       <w:b/>
+      <w:color w:val="345A8A"/>
       <w:sz w:val="20"/>
       <w:szCs w:val="20"/>
     </w:rPr>
@@ -3719,321 +4237,191 @@
     <w:rPr/>
   </w:style>
   <w:style w:styleId="Heading1" w:type="paragraph">
-    <w:name w:val="heading 1"/>
+    <w:name w:val="Heading 1"/>
     <w:basedOn w:val="Normal"/>
     <w:next w:val="BodyText"/>
-    <w:link w:val="Heading1Char"/>
     <w:uiPriority w:val="9"/>
     <w:qFormat/>
-    <w:rsid w:val="00A10FD9"/>
     <w:pPr>
       <w:keepNext/>
       <w:keepLines/>
-      <w:spacing w:after="80" w:before="360"/>
+      <w:spacing w:after="0" w:before="480"/>
       <w:outlineLvl w:val="0"/>
     </w:pPr>
     <w:rPr>
       <w:rFonts w:asciiTheme="majorHAnsi" w:cstheme="majorBidi" w:eastAsiaTheme="majorEastAsia" w:hAnsiTheme="majorHAnsi"/>
-      <w:color w:themeColor="accent1" w:themeShade="BF" w:val="0F4761"/>
-      <w:sz w:val="40"/>
-      <w:szCs w:val="40"/>
+      <w:b/>
+      <w:bCs/>
+      <w:color w:themeColor="accent1" w:val="4F81BD"/>
+      <w:sz w:val="32"/>
+      <w:szCs w:val="32"/>
     </w:rPr>
   </w:style>
   <w:style w:styleId="Heading2" w:type="paragraph">
-    <w:name w:val="heading 2"/>
+    <w:name w:val="Heading 2"/>
     <w:basedOn w:val="Normal"/>
     <w:next w:val="BodyText"/>
-    <w:link w:val="Heading2Char"/>
     <w:uiPriority w:val="9"/>
-    <w:semiHidden/>
     <w:unhideWhenUsed/>
     <w:qFormat/>
-    <w:rsid w:val="00A10FD9"/>
     <w:pPr>
       <w:keepNext/>
       <w:keepLines/>
-      <w:spacing w:after="80" w:before="160"/>
+      <w:spacing w:after="0" w:before="200"/>
       <w:outlineLvl w:val="1"/>
     </w:pPr>
     <w:rPr>
       <w:rFonts w:asciiTheme="majorHAnsi" w:cstheme="majorBidi" w:eastAsiaTheme="majorEastAsia" w:hAnsiTheme="majorHAnsi"/>
-      <w:color w:themeColor="accent1" w:themeShade="BF" w:val="0F4761"/>
-      <w:sz w:val="32"/>
-      <w:szCs w:val="32"/>
+      <w:b/>
+      <w:bCs/>
+      <w:color w:themeColor="accent1" w:val="4F81BD"/>
+      <w:sz w:val="28"/>
+      <w:szCs w:val="28"/>
     </w:rPr>
   </w:style>
   <w:style w:styleId="Heading3" w:type="paragraph">
-    <w:name w:val="heading 3"/>
+    <w:name w:val="Heading 3"/>
     <w:basedOn w:val="Normal"/>
     <w:next w:val="BodyText"/>
-    <w:link w:val="Heading3Char"/>
     <w:uiPriority w:val="9"/>
-    <w:semiHidden/>
     <w:unhideWhenUsed/>
     <w:qFormat/>
-    <w:rsid w:val="00A10FD9"/>
     <w:pPr>
       <w:keepNext/>
       <w:keepLines/>
-      <w:spacing w:after="80" w:before="160"/>
+      <w:spacing w:after="0" w:before="200"/>
       <w:outlineLvl w:val="2"/>
     </w:pPr>
     <w:rPr>
-      <w:rFonts w:cstheme="majorBidi" w:eastAsiaTheme="majorEastAsia"/>
-      <w:color w:themeColor="accent1" w:themeShade="BF" w:val="0F4761"/>
-      <w:sz w:val="28"/>
-      <w:szCs w:val="28"/>
+      <w:rFonts w:asciiTheme="majorHAnsi" w:cstheme="majorBidi" w:eastAsiaTheme="majorEastAsia" w:hAnsiTheme="majorHAnsi"/>
+      <w:b/>
+      <w:bCs/>
+      <w:color w:themeColor="accent1" w:val="4F81BD"/>
+      <w:sz w:val="24"/>
+      <w:szCs w:val="24"/>
     </w:rPr>
   </w:style>
   <w:style w:styleId="Heading4" w:type="paragraph">
-    <w:name w:val="heading 4"/>
+    <w:name w:val="Heading 4"/>
     <w:basedOn w:val="Normal"/>
     <w:next w:val="BodyText"/>
-    <w:link w:val="Heading4Char"/>
     <w:uiPriority w:val="9"/>
-    <w:semiHidden/>
     <w:unhideWhenUsed/>
     <w:qFormat/>
-    <w:rsid w:val="00A10FD9"/>
     <w:pPr>
       <w:keepNext/>
       <w:keepLines/>
-      <w:spacing w:after="40" w:before="80"/>
+      <w:spacing w:after="0" w:before="200"/>
       <w:outlineLvl w:val="3"/>
     </w:pPr>
     <w:rPr>
-      <w:rFonts w:cstheme="majorBidi" w:eastAsiaTheme="majorEastAsia"/>
+      <w:rFonts w:asciiTheme="majorHAnsi" w:cstheme="majorBidi" w:eastAsiaTheme="majorEastAsia" w:hAnsiTheme="majorHAnsi"/>
+      <w:bCs/>
       <w:i/>
-      <w:iCs/>
-      <w:color w:themeColor="accent1" w:themeShade="BF" w:val="0F4761"/>
+      <w:color w:themeColor="accent1" w:val="4F81BD"/>
+      <w:sz w:val="24"/>
+      <w:szCs w:val="24"/>
     </w:rPr>
   </w:style>
   <w:style w:styleId="Heading5" w:type="paragraph">
-    <w:name w:val="heading 5"/>
+    <w:name w:val="Heading 5"/>
     <w:basedOn w:val="Normal"/>
     <w:next w:val="BodyText"/>
-    <w:link w:val="Heading5Char"/>
     <w:uiPriority w:val="9"/>
-    <w:semiHidden/>
     <w:unhideWhenUsed/>
     <w:qFormat/>
-    <w:rsid w:val="00A10FD9"/>
     <w:pPr>
       <w:keepNext/>
       <w:keepLines/>
-      <w:spacing w:after="40" w:before="80"/>
+      <w:spacing w:after="0" w:before="200"/>
       <w:outlineLvl w:val="4"/>
     </w:pPr>
     <w:rPr>
-      <w:rFonts w:cstheme="majorBidi" w:eastAsiaTheme="majorEastAsia"/>
-      <w:color w:themeColor="accent1" w:themeShade="BF" w:val="0F4761"/>
+      <w:rFonts w:asciiTheme="majorHAnsi" w:cstheme="majorBidi" w:eastAsiaTheme="majorEastAsia" w:hAnsiTheme="majorHAnsi"/>
+      <w:iCs/>
+      <w:color w:themeColor="accent1" w:val="4F81BD"/>
+      <w:sz w:val="24"/>
+      <w:szCs w:val="24"/>
     </w:rPr>
   </w:style>
   <w:style w:styleId="Heading6" w:type="paragraph">
-    <w:name w:val="heading 6"/>
+    <w:name w:val="Heading 6"/>
     <w:basedOn w:val="Normal"/>
     <w:next w:val="BodyText"/>
-    <w:link w:val="Heading6Char"/>
     <w:uiPriority w:val="9"/>
-    <w:semiHidden/>
     <w:unhideWhenUsed/>
     <w:qFormat/>
-    <w:rsid w:val="00A10FD9"/>
     <w:pPr>
       <w:keepNext/>
       <w:keepLines/>
-      <w:spacing w:after="0" w:before="40"/>
+      <w:spacing w:after="0" w:before="200"/>
       <w:outlineLvl w:val="5"/>
     </w:pPr>
     <w:rPr>
-      <w:rFonts w:cstheme="majorBidi" w:eastAsiaTheme="majorEastAsia"/>
-      <w:i/>
-      <w:iCs/>
-      <w:color w:themeColor="text1" w:themeTint="A6" w:val="595959"/>
+      <w:rFonts w:asciiTheme="majorHAnsi" w:cstheme="majorBidi" w:eastAsiaTheme="majorEastAsia" w:hAnsiTheme="majorHAnsi"/>
+      <w:color w:themeColor="accent1" w:val="4F81BD"/>
+      <w:sz w:val="24"/>
+      <w:szCs w:val="24"/>
     </w:rPr>
   </w:style>
   <w:style w:styleId="Heading7" w:type="paragraph">
-    <w:name w:val="heading 7"/>
+    <w:name w:val="Heading 7"/>
     <w:basedOn w:val="Normal"/>
     <w:next w:val="BodyText"/>
-    <w:link w:val="Heading7Char"/>
     <w:uiPriority w:val="9"/>
-    <w:semiHidden/>
     <w:unhideWhenUsed/>
     <w:qFormat/>
-    <w:rsid w:val="00A10FD9"/>
     <w:pPr>
       <w:keepNext/>
       <w:keepLines/>
-      <w:spacing w:after="0" w:before="40"/>
+      <w:spacing w:after="0" w:before="200"/>
       <w:outlineLvl w:val="6"/>
     </w:pPr>
     <w:rPr>
-      <w:rFonts w:cstheme="majorBidi" w:eastAsiaTheme="majorEastAsia"/>
-      <w:color w:themeColor="text1" w:themeTint="A6" w:val="595959"/>
+      <w:rFonts w:asciiTheme="majorHAnsi" w:cstheme="majorBidi" w:eastAsiaTheme="majorEastAsia" w:hAnsiTheme="majorHAnsi"/>
+      <w:color w:themeColor="accent1" w:val="4F81BD"/>
+      <w:sz w:val="24"/>
+      <w:szCs w:val="24"/>
     </w:rPr>
   </w:style>
   <w:style w:styleId="Heading8" w:type="paragraph">
-    <w:name w:val="heading 8"/>
+    <w:name w:val="Heading 8"/>
     <w:basedOn w:val="Normal"/>
     <w:next w:val="BodyText"/>
-    <w:link w:val="Heading8Char"/>
     <w:uiPriority w:val="9"/>
-    <w:semiHidden/>
     <w:unhideWhenUsed/>
     <w:qFormat/>
-    <w:rsid w:val="00A10FD9"/>
     <w:pPr>
       <w:keepNext/>
       <w:keepLines/>
-      <w:spacing w:after="0"/>
+      <w:spacing w:after="0" w:before="200"/>
       <w:outlineLvl w:val="7"/>
     </w:pPr>
     <w:rPr>
-      <w:rFonts w:cstheme="majorBidi" w:eastAsiaTheme="majorEastAsia"/>
-      <w:i/>
-      <w:iCs/>
-      <w:color w:themeColor="text1" w:themeTint="D8" w:val="272727"/>
+      <w:rFonts w:asciiTheme="majorHAnsi" w:cstheme="majorBidi" w:eastAsiaTheme="majorEastAsia" w:hAnsiTheme="majorHAnsi"/>
+      <w:color w:themeColor="accent1" w:val="4F81BD"/>
+      <w:sz w:val="24"/>
+      <w:szCs w:val="24"/>
     </w:rPr>
   </w:style>
   <w:style w:styleId="Heading9" w:type="paragraph">
-    <w:name w:val="heading 9"/>
+    <w:name w:val="Heading 9"/>
     <w:basedOn w:val="Normal"/>
     <w:next w:val="BodyText"/>
-    <w:link w:val="Heading9Char"/>
     <w:uiPriority w:val="9"/>
-    <w:semiHidden/>
     <w:unhideWhenUsed/>
     <w:qFormat/>
-    <w:rsid w:val="00A10FD9"/>
     <w:pPr>
       <w:keepNext/>
       <w:keepLines/>
-      <w:spacing w:after="0"/>
+      <w:spacing w:after="0" w:before="200"/>
       <w:outlineLvl w:val="8"/>
     </w:pPr>
     <w:rPr>
-      <w:rFonts w:cstheme="majorBidi" w:eastAsiaTheme="majorEastAsia"/>
-      <w:color w:themeColor="text1" w:themeTint="D8" w:val="272727"/>
-    </w:rPr>
-  </w:style>
-  <w:style w:customStyle="1" w:styleId="Heading1Char" w:type="character">
-    <w:name w:val="Heading 1 Char"/>
-    <w:basedOn w:val="DefaultParagraphFont"/>
-    <w:link w:val="Heading1"/>
-    <w:uiPriority w:val="9"/>
-    <w:rsid w:val="00A10FD9"/>
-    <w:rPr>
       <w:rFonts w:asciiTheme="majorHAnsi" w:cstheme="majorBidi" w:eastAsiaTheme="majorEastAsia" w:hAnsiTheme="majorHAnsi"/>
-      <w:color w:themeColor="accent1" w:themeShade="BF" w:val="0F4761"/>
-      <w:sz w:val="40"/>
-      <w:szCs w:val="40"/>
-    </w:rPr>
-  </w:style>
-  <w:style w:customStyle="1" w:styleId="Heading2Char" w:type="character">
-    <w:name w:val="Heading 2 Char"/>
-    <w:basedOn w:val="DefaultParagraphFont"/>
-    <w:link w:val="Heading2"/>
-    <w:uiPriority w:val="9"/>
-    <w:semiHidden/>
-    <w:rsid w:val="00A10FD9"/>
-    <w:rPr>
-      <w:rFonts w:asciiTheme="majorHAnsi" w:cstheme="majorBidi" w:eastAsiaTheme="majorEastAsia" w:hAnsiTheme="majorHAnsi"/>
-      <w:color w:themeColor="accent1" w:themeShade="BF" w:val="0F4761"/>
-      <w:sz w:val="32"/>
-      <w:szCs w:val="32"/>
-    </w:rPr>
-  </w:style>
-  <w:style w:customStyle="1" w:styleId="Heading3Char" w:type="character">
-    <w:name w:val="Heading 3 Char"/>
-    <w:basedOn w:val="DefaultParagraphFont"/>
-    <w:link w:val="Heading3"/>
-    <w:uiPriority w:val="9"/>
-    <w:semiHidden/>
-    <w:rsid w:val="00A10FD9"/>
-    <w:rPr>
-      <w:rFonts w:cstheme="majorBidi" w:eastAsiaTheme="majorEastAsia"/>
-      <w:color w:themeColor="accent1" w:themeShade="BF" w:val="0F4761"/>
-      <w:sz w:val="28"/>
-      <w:szCs w:val="28"/>
-    </w:rPr>
-  </w:style>
-  <w:style w:customStyle="1" w:styleId="Heading4Char" w:type="character">
-    <w:name w:val="Heading 4 Char"/>
-    <w:basedOn w:val="DefaultParagraphFont"/>
-    <w:link w:val="Heading4"/>
-    <w:uiPriority w:val="9"/>
-    <w:semiHidden/>
-    <w:rsid w:val="00A10FD9"/>
-    <w:rPr>
-      <w:rFonts w:cstheme="majorBidi" w:eastAsiaTheme="majorEastAsia"/>
-      <w:i/>
-      <w:iCs/>
-      <w:color w:themeColor="accent1" w:themeShade="BF" w:val="0F4761"/>
-    </w:rPr>
-  </w:style>
-  <w:style w:customStyle="1" w:styleId="Heading5Char" w:type="character">
-    <w:name w:val="Heading 5 Char"/>
-    <w:basedOn w:val="DefaultParagraphFont"/>
-    <w:link w:val="Heading5"/>
-    <w:uiPriority w:val="9"/>
-    <w:semiHidden/>
-    <w:rsid w:val="00A10FD9"/>
-    <w:rPr>
-      <w:rFonts w:cstheme="majorBidi" w:eastAsiaTheme="majorEastAsia"/>
-      <w:color w:themeColor="accent1" w:themeShade="BF" w:val="0F4761"/>
-    </w:rPr>
-  </w:style>
-  <w:style w:customStyle="1" w:styleId="Heading6Char" w:type="character">
-    <w:name w:val="Heading 6 Char"/>
-    <w:basedOn w:val="DefaultParagraphFont"/>
-    <w:link w:val="Heading6"/>
-    <w:uiPriority w:val="9"/>
-    <w:semiHidden/>
-    <w:rsid w:val="00A10FD9"/>
-    <w:rPr>
-      <w:rFonts w:cstheme="majorBidi" w:eastAsiaTheme="majorEastAsia"/>
-      <w:i/>
-      <w:iCs/>
-      <w:color w:themeColor="text1" w:themeTint="A6" w:val="595959"/>
-    </w:rPr>
-  </w:style>
-  <w:style w:customStyle="1" w:styleId="Heading7Char" w:type="character">
-    <w:name w:val="Heading 7 Char"/>
-    <w:basedOn w:val="DefaultParagraphFont"/>
-    <w:link w:val="Heading7"/>
-    <w:uiPriority w:val="9"/>
-    <w:semiHidden/>
-    <w:rsid w:val="00A10FD9"/>
-    <w:rPr>
-      <w:rFonts w:cstheme="majorBidi" w:eastAsiaTheme="majorEastAsia"/>
-      <w:color w:themeColor="text1" w:themeTint="A6" w:val="595959"/>
-    </w:rPr>
-  </w:style>
-  <w:style w:customStyle="1" w:styleId="Heading8Char" w:type="character">
-    <w:name w:val="Heading 8 Char"/>
-    <w:basedOn w:val="DefaultParagraphFont"/>
-    <w:link w:val="Heading8"/>
-    <w:uiPriority w:val="9"/>
-    <w:semiHidden/>
-    <w:rsid w:val="00A10FD9"/>
-    <w:rPr>
-      <w:rFonts w:cstheme="majorBidi" w:eastAsiaTheme="majorEastAsia"/>
-      <w:i/>
-      <w:iCs/>
-      <w:color w:themeColor="text1" w:themeTint="D8" w:val="272727"/>
-    </w:rPr>
-  </w:style>
-  <w:style w:customStyle="1" w:styleId="Heading9Char" w:type="character">
-    <w:name w:val="Heading 9 Char"/>
-    <w:basedOn w:val="DefaultParagraphFont"/>
-    <w:link w:val="Heading9"/>
-    <w:uiPriority w:val="9"/>
-    <w:semiHidden/>
-    <w:rsid w:val="00A10FD9"/>
-    <w:rPr>
-      <w:rFonts w:cstheme="majorBidi" w:eastAsiaTheme="majorEastAsia"/>
-      <w:color w:themeColor="text1" w:themeTint="D8" w:val="272727"/>
+      <w:color w:themeColor="accent1" w:val="4F81BD"/>
+      <w:sz w:val="24"/>
+      <w:szCs w:val="24"/>
     </w:rPr>
   </w:style>
   <w:style w:styleId="BlockText" w:type="paragraph">
@@ -4058,8 +4446,8 @@
   </w:style>
   <w:style w:styleId="FootnoteBlockText" w:type="paragraph">
     <w:name w:val="Footnote Block Text"/>
-    <w:basedOn w:val="FootnoteText"/>
-    <w:next w:val="FootnoteText"/>
+    <w:basedOn w:val="Footnote Text"/>
+    <w:next w:val="Footnote Text"/>
     <w:uiPriority w:val="9"/>
     <w:unhideWhenUsed/>
     <w:qFormat/>
@@ -4089,6 +4477,13 @@
       </w:tblCellMar>
     </w:tblPr>
     <w:tblStylePr w:type="firstRow">
+      <w:tblPr>
+        <w:jc w:val="left"/>
+        <w:tblInd w:type="dxa" w:w="0"/>
+      </w:tblPr>
+      <w:trPr>
+        <w:jc w:val="left"/>
+      </w:trPr>
       <w:tcPr>
         <w:tcBorders>
           <w:bottom w:val="single"/>
@@ -4444,44 +4839,44 @@
         <a:sysClr val="window" lastClr="FFFFFF"/>
       </a:lt1>
       <a:dk2>
-        <a:srgbClr val="0E2841"/>
+        <a:srgbClr val="1F497D"/>
       </a:dk2>
       <a:lt2>
-        <a:srgbClr val="E8E8E8"/>
+        <a:srgbClr val="EEECE1"/>
       </a:lt2>
       <a:accent1>
-        <a:srgbClr val="156082"/>
+        <a:srgbClr val="4F81BD"/>
       </a:accent1>
       <a:accent2>
-        <a:srgbClr val="E97132"/>
+        <a:srgbClr val="C0504D"/>
       </a:accent2>
       <a:accent3>
-        <a:srgbClr val="196B24"/>
+        <a:srgbClr val="9BBB59"/>
       </a:accent3>
       <a:accent4>
-        <a:srgbClr val="0F9ED5"/>
+        <a:srgbClr val="8064A2"/>
       </a:accent4>
       <a:accent5>
-        <a:srgbClr val="A02B93"/>
+        <a:srgbClr val="4BACC6"/>
       </a:accent5>
       <a:accent6>
-        <a:srgbClr val="4EA72E"/>
+        <a:srgbClr val="F79646"/>
       </a:accent6>
       <a:hlink>
-        <a:srgbClr val="467886"/>
+        <a:srgbClr val="0000FF"/>
       </a:hlink>
       <a:folHlink>
-        <a:srgbClr val="96607D"/>
+        <a:srgbClr val="800080"/>
       </a:folHlink>
     </a:clrScheme>
     <a:fontScheme name="Office">
       <a:majorFont>
-        <a:latin typeface="Aptos Display" panose="02110004020202020204"/>
+        <a:latin typeface="Calibri"/>
         <a:ea typeface=""/>
         <a:cs typeface=""/>
-        <a:font script="Jpan" typeface="游ゴシック Light"/>
+        <a:font script="Jpan" typeface="ＭＳ ゴシック"/>
         <a:font script="Hang" typeface="맑은 고딕"/>
-        <a:font script="Hans" typeface="等线 Light"/>
+        <a:font script="Hans" typeface="宋体"/>
         <a:font script="Hant" typeface="新細明體"/>
         <a:font script="Arab" typeface="Times New Roman"/>
         <a:font script="Hebr" typeface="Times New Roman"/>
@@ -4508,32 +4903,14 @@
         <a:font script="Mong" typeface="Mongolian Baiti"/>
         <a:font script="Viet" typeface="Times New Roman"/>
         <a:font script="Uigh" typeface="Microsoft Uighur"/>
-        <a:font script="Geor" typeface="Sylfaen"/>
-        <a:font script="Armn" typeface="Arial"/>
-        <a:font script="Bugi" typeface="Leelawadee UI"/>
-        <a:font script="Bopo" typeface="Microsoft JhengHei"/>
-        <a:font script="Java" typeface="Javanese Text"/>
-        <a:font script="Lisu" typeface="Segoe UI"/>
-        <a:font script="Mymr" typeface="Myanmar Text"/>
-        <a:font script="Nkoo" typeface="Ebrima"/>
-        <a:font script="Olck" typeface="Nirmala UI"/>
-        <a:font script="Osma" typeface="Ebrima"/>
-        <a:font script="Phag" typeface="Phagspa"/>
-        <a:font script="Syrn" typeface="Estrangelo Edessa"/>
-        <a:font script="Syrj" typeface="Estrangelo Edessa"/>
-        <a:font script="Syre" typeface="Estrangelo Edessa"/>
-        <a:font script="Sora" typeface="Nirmala UI"/>
-        <a:font script="Tale" typeface="Microsoft Tai Le"/>
-        <a:font script="Talu" typeface="Microsoft New Tai Lue"/>
-        <a:font script="Tfng" typeface="Ebrima"/>
       </a:majorFont>
       <a:minorFont>
-        <a:latin typeface="Aptos" panose="02110004020202020204"/>
+        <a:latin typeface="Cambria"/>
         <a:ea typeface=""/>
         <a:cs typeface=""/>
-        <a:font script="Jpan" typeface="游明朝"/>
+        <a:font script="Jpan" typeface="ＭＳ 明朝"/>
         <a:font script="Hang" typeface="맑은 고딕"/>
-        <a:font script="Hans" typeface="等线"/>
+        <a:font script="Hans" typeface="宋体"/>
         <a:font script="Hant" typeface="新細明體"/>
         <a:font script="Arab" typeface="Arial"/>
         <a:font script="Hebr" typeface="Arial"/>
@@ -4560,24 +4937,6 @@
         <a:font script="Mong" typeface="Mongolian Baiti"/>
         <a:font script="Viet" typeface="Arial"/>
         <a:font script="Uigh" typeface="Microsoft Uighur"/>
-        <a:font script="Geor" typeface="Sylfaen"/>
-        <a:font script="Armn" typeface="Arial"/>
-        <a:font script="Bugi" typeface="Leelawadee UI"/>
-        <a:font script="Bopo" typeface="Microsoft JhengHei"/>
-        <a:font script="Java" typeface="Javanese Text"/>
-        <a:font script="Lisu" typeface="Segoe UI"/>
-        <a:font script="Mymr" typeface="Myanmar Text"/>
-        <a:font script="Nkoo" typeface="Ebrima"/>
-        <a:font script="Olck" typeface="Nirmala UI"/>
-        <a:font script="Osma" typeface="Ebrima"/>
-        <a:font script="Phag" typeface="Phagspa"/>
-        <a:font script="Syrn" typeface="Estrangelo Edessa"/>
-        <a:font script="Syrj" typeface="Estrangelo Edessa"/>
-        <a:font script="Syre" typeface="Estrangelo Edessa"/>
-        <a:font script="Sora" typeface="Nirmala UI"/>
-        <a:font script="Tale" typeface="Microsoft Tai Le"/>
-        <a:font script="Talu" typeface="Microsoft New Tai Lue"/>
-        <a:font script="Tfng" typeface="Ebrima"/>
       </a:minorFont>
     </a:fontScheme>
     <a:fmtScheme name="Office">
@@ -4589,141 +4948,200 @@
           <a:gsLst>
             <a:gs pos="0">
               <a:schemeClr val="phClr">
-                <a:lumMod val="110000"/>
-                <a:satMod val="105000"/>
-                <a:tint val="67000"/>
+                <a:tint val="50000"/>
+                <a:satMod val="300000"/>
               </a:schemeClr>
             </a:gs>
-            <a:gs pos="50000">
+            <a:gs pos="35000">
               <a:schemeClr val="phClr">
-                <a:lumMod val="105000"/>
-                <a:satMod val="103000"/>
-                <a:tint val="73000"/>
+                <a:tint val="37000"/>
+                <a:satMod val="300000"/>
               </a:schemeClr>
             </a:gs>
             <a:gs pos="100000">
               <a:schemeClr val="phClr">
-                <a:lumMod val="105000"/>
-                <a:satMod val="109000"/>
-                <a:tint val="81000"/>
+                <a:tint val="15000"/>
+                <a:satMod val="350000"/>
               </a:schemeClr>
             </a:gs>
           </a:gsLst>
-          <a:lin ang="5400000" scaled="0"/>
+          <a:lin ang="16200000" scaled="1"/>
         </a:gradFill>
         <a:gradFill rotWithShape="1">
           <a:gsLst>
             <a:gs pos="0">
               <a:schemeClr val="phClr">
-                <a:satMod val="103000"/>
-                <a:lumMod val="102000"/>
-                <a:tint val="94000"/>
-              </a:schemeClr>
-            </a:gs>
-            <a:gs pos="50000">
-              <a:schemeClr val="phClr">
-                <a:satMod val="110000"/>
-                <a:lumMod val="100000"/>
+                <a:tint val="100000"/>
                 <a:shade val="100000"/>
+                <a:satMod val="130000"/>
               </a:schemeClr>
             </a:gs>
             <a:gs pos="100000">
               <a:schemeClr val="phClr">
-                <a:lumMod val="99000"/>
-                <a:satMod val="120000"/>
-                <a:shade val="78000"/>
+                <a:tint val="50000"/>
+                <a:shade val="100000"/>
+                <a:satMod val="350000"/>
               </a:schemeClr>
             </a:gs>
           </a:gsLst>
-          <a:lin ang="5400000" scaled="0"/>
+          <a:lin ang="16200000" scaled="0"/>
         </a:gradFill>
       </a:fillStyleLst>
       <a:lnStyleLst>
-        <a:ln w="6350" cap="flat" cmpd="sng" algn="ctr">
+        <a:ln w="9525" cap="flat" cmpd="sng" algn="ctr">
+          <a:solidFill>
+            <a:schemeClr val="phClr">
+              <a:shade val="95000"/>
+              <a:satMod val="105000"/>
+            </a:schemeClr>
+          </a:solidFill>
+          <a:prstDash val="solid"/>
+        </a:ln>
+        <a:ln w="25400" cap="flat" cmpd="sng" algn="ctr">
           <a:solidFill>
             <a:schemeClr val="phClr"/>
           </a:solidFill>
           <a:prstDash val="solid"/>
-          <a:miter lim="800000"/>
         </a:ln>
-        <a:ln w="12700" cap="flat" cmpd="sng" algn="ctr">
+        <a:ln w="38100" cap="flat" cmpd="sng" algn="ctr">
           <a:solidFill>
             <a:schemeClr val="phClr"/>
           </a:solidFill>
           <a:prstDash val="solid"/>
-          <a:miter lim="800000"/>
-        </a:ln>
-        <a:ln w="19050" cap="flat" cmpd="sng" algn="ctr">
-          <a:solidFill>
-            <a:schemeClr val="phClr"/>
-          </a:solidFill>
-          <a:prstDash val="solid"/>
-          <a:miter lim="800000"/>
         </a:ln>
       </a:lnStyleLst>
       <a:effectStyleLst>
         <a:effectStyle>
-          <a:effectLst/>
-        </a:effectStyle>
-        <a:effectStyle>
-          <a:effectLst/>
+          <a:effectLst>
+            <a:outerShdw blurRad="40000" dist="20000" dir="5400000" rotWithShape="0">
+              <a:srgbClr val="000000">
+                <a:alpha val="38000"/>
+              </a:srgbClr>
+            </a:outerShdw>
+          </a:effectLst>
         </a:effectStyle>
         <a:effectStyle>
           <a:effectLst>
-            <a:outerShdw blurRad="57150" dist="19050" dir="5400000" algn="ctr" rotWithShape="0">
+            <a:outerShdw blurRad="40000" dist="23000" dir="5400000" rotWithShape="0">
               <a:srgbClr val="000000">
-                <a:alpha val="63000"/>
+                <a:alpha val="35000"/>
               </a:srgbClr>
             </a:outerShdw>
           </a:effectLst>
+        </a:effectStyle>
+        <a:effectStyle>
+          <a:effectLst>
+            <a:outerShdw blurRad="40000" dist="23000" dir="5400000" rotWithShape="0">
+              <a:srgbClr val="000000">
+                <a:alpha val="35000"/>
+              </a:srgbClr>
+            </a:outerShdw>
+          </a:effectLst>
+          <a:scene3d>
+            <a:camera prst="orthographicFront">
+              <a:rot lat="0" lon="0" rev="0"/>
+            </a:camera>
+            <a:lightRig rig="threePt" dir="t">
+              <a:rot lat="0" lon="0" rev="1200000"/>
+            </a:lightRig>
+          </a:scene3d>
+          <a:sp3d>
+            <a:bevelT w="63500" h="25400"/>
+          </a:sp3d>
         </a:effectStyle>
       </a:effectStyleLst>
       <a:bgFillStyleLst>
         <a:solidFill>
           <a:schemeClr val="phClr"/>
         </a:solidFill>
-        <a:solidFill>
-          <a:schemeClr val="phClr">
-            <a:tint val="95000"/>
-            <a:satMod val="170000"/>
-          </a:schemeClr>
-        </a:solidFill>
         <a:gradFill rotWithShape="1">
           <a:gsLst>
             <a:gs pos="0">
               <a:schemeClr val="phClr">
-                <a:tint val="93000"/>
-                <a:satMod val="150000"/>
-                <a:shade val="98000"/>
-                <a:lumMod val="102000"/>
+                <a:tint val="40000"/>
+                <a:satMod val="350000"/>
               </a:schemeClr>
             </a:gs>
-            <a:gs pos="50000">
+            <a:gs pos="40000">
               <a:schemeClr val="phClr">
-                <a:tint val="98000"/>
-                <a:satMod val="130000"/>
-                <a:shade val="90000"/>
-                <a:lumMod val="103000"/>
+                <a:tint val="45000"/>
+                <a:shade val="99000"/>
+                <a:satMod val="350000"/>
               </a:schemeClr>
             </a:gs>
             <a:gs pos="100000">
               <a:schemeClr val="phClr">
-                <a:shade val="63000"/>
-                <a:satMod val="120000"/>
+                <a:shade val="20000"/>
+                <a:satMod val="255000"/>
               </a:schemeClr>
             </a:gs>
           </a:gsLst>
-          <a:lin ang="5400000" scaled="0"/>
+          <a:path path="circle">
+            <a:fillToRect l="50000" t="-80000" r="50000" b="180000"/>
+          </a:path>
+        </a:gradFill>
+        <a:gradFill rotWithShape="1">
+          <a:gsLst>
+            <a:gs pos="0">
+              <a:schemeClr val="phClr">
+                <a:tint val="80000"/>
+                <a:satMod val="300000"/>
+              </a:schemeClr>
+            </a:gs>
+            <a:gs pos="100000">
+              <a:schemeClr val="phClr">
+                <a:shade val="30000"/>
+                <a:satMod val="200000"/>
+              </a:schemeClr>
+            </a:gs>
+          </a:gsLst>
+          <a:path path="circle">
+            <a:fillToRect l="50000" t="50000" r="50000" b="50000"/>
+          </a:path>
         </a:gradFill>
       </a:bgFillStyleLst>
     </a:fmtScheme>
   </a:themeElements>
-  <a:objectDefaults/>
+  <a:objectDefaults>
+    <a:spDef>
+      <a:spPr/>
+      <a:bodyPr/>
+      <a:lstStyle/>
+      <a:style>
+        <a:lnRef idx="1">
+          <a:schemeClr val="accent1"/>
+        </a:lnRef>
+        <a:fillRef idx="3">
+          <a:schemeClr val="accent1"/>
+        </a:fillRef>
+        <a:effectRef idx="2">
+          <a:schemeClr val="accent1"/>
+        </a:effectRef>
+        <a:fontRef idx="minor">
+          <a:schemeClr val="lt1"/>
+        </a:fontRef>
+      </a:style>
+    </a:spDef>
+    <a:lnDef>
+      <a:spPr/>
+      <a:bodyPr/>
+      <a:lstStyle/>
+      <a:style>
+        <a:lnRef idx="2">
+          <a:schemeClr val="accent1"/>
+        </a:lnRef>
+        <a:fillRef idx="0">
+          <a:schemeClr val="accent1"/>
+        </a:fillRef>
+        <a:effectRef idx="1">
+          <a:schemeClr val="accent1"/>
+        </a:effectRef>
+        <a:fontRef idx="minor">
+          <a:schemeClr val="tx1"/>
+        </a:fontRef>
+      </a:style>
+    </a:lnDef>
+  </a:objectDefaults>
   <a:extraClrSchemeLst/>
-  <a:extLst>
-    <a:ext uri="{05A4C25C-085E-4340-85A3-A5531E510DB2}">
-      <thm15:themeFamily xmlns:thm15="http://schemas.microsoft.com/office/thememl/2012/main" name="Office Theme" id="{2E142A2C-CD16-42D6-873A-C26D2A0506FA}" vid="{1BDDFF52-6CD6-40A5-AB3C-68EB2F1E4D0A}"/>
-    </a:ext>
-  </a:extLst>
 </a:theme>
 </file>
</xml_diff>